<commit_message>
rework on initial thesis description
</commit_message>
<xml_diff>
--- a/documents/Study Structure of Master Thesis.docx
+++ b/documents/Study Structure of Master Thesis.docx
@@ -53,13 +53,39 @@
         <w:rPr>
           <w:lang w:val="en-GB"/>
         </w:rPr>
-        <w:t xml:space="preserve"> This work is condocted with and for stakeholders at Swiss Post DWH LS OPS (Data warehouse Logistic Services Operations). The stakeholders define the standard reports to </w:t>
+        <w:t xml:space="preserve"> This work </w:t>
       </w:r>
       <w:proofErr w:type="gramStart"/>
       <w:r>
         <w:rPr>
           <w:lang w:val="en-GB"/>
         </w:rPr>
+        <w:t>is cond</w:t>
+      </w:r>
+      <w:r>
+        <w:rPr>
+          <w:lang w:val="en-GB"/>
+        </w:rPr>
+        <w:t>u</w:t>
+      </w:r>
+      <w:r>
+        <w:rPr>
+          <w:lang w:val="en-GB"/>
+        </w:rPr>
+        <w:t>cted</w:t>
+      </w:r>
+      <w:proofErr w:type="gramEnd"/>
+      <w:r>
+        <w:rPr>
+          <w:lang w:val="en-GB"/>
+        </w:rPr>
+        <w:t xml:space="preserve"> with and for stakeholders at Swiss Post DWH LS OPS (Data warehouse Logistic Services Operations). The stakeholders define the standard reports to </w:t>
+      </w:r>
+      <w:proofErr w:type="gramStart"/>
+      <w:r>
+        <w:rPr>
+          <w:lang w:val="en-GB"/>
+        </w:rPr>
         <w:t>be used</w:t>
       </w:r>
       <w:proofErr w:type="gramEnd"/>
@@ -67,49 +93,71 @@
         <w:rPr>
           <w:lang w:val="en-GB"/>
         </w:rPr>
-        <w:t xml:space="preserve"> for all analytical reporting of all mail and parcel related workflows such as sorting, delivery </w:t>
+        <w:t xml:space="preserve"> for all analytical reporting of all mail and parcel related workflows such as sorting, delivery etc. </w:t>
+      </w:r>
+    </w:p>
+    <w:p>
+      <w:pPr>
+        <w:ind w:left="720" w:hanging="360"/>
+        <w:rPr>
+          <w:lang w:val="en-GB"/>
+        </w:rPr>
+      </w:pPr>
+      <w:r>
+        <w:rPr>
+          <w:lang w:val="en-GB"/>
+        </w:rPr>
+        <w:t>It shows first the previous work, and then goes trough the research question, basi</w:t>
+      </w:r>
+      <w:r>
+        <w:rPr>
+          <w:lang w:val="en-GB"/>
+        </w:rPr>
+        <w:t>c</w:t>
+      </w:r>
+      <w:r>
+        <w:rPr>
+          <w:lang w:val="en-GB"/>
+        </w:rPr>
+        <w:t xml:space="preserve"> project management that will </w:t>
       </w:r>
       <w:proofErr w:type="gramStart"/>
       <w:r>
         <w:rPr>
           <w:lang w:val="en-GB"/>
         </w:rPr>
-        <w:t>etc.</w:t>
+        <w:t>be applied</w:t>
       </w:r>
       <w:proofErr w:type="gramEnd"/>
       <w:r>
         <w:rPr>
           <w:lang w:val="en-GB"/>
         </w:rPr>
-        <w:t xml:space="preserve"> </w:t>
-      </w:r>
-    </w:p>
-    <w:p>
-      <w:pPr>
-        <w:ind w:left="720" w:hanging="360"/>
-        <w:rPr>
-          <w:lang w:val="en-GB"/>
-        </w:rPr>
-      </w:pPr>
-      <w:r>
-        <w:rPr>
-          <w:lang w:val="en-GB"/>
-        </w:rPr>
-        <w:t xml:space="preserve">It shows first the previous work, and then goes trough the research question, basis project management that will </w:t>
-      </w:r>
-      <w:proofErr w:type="gramStart"/>
-      <w:r>
-        <w:rPr>
-          <w:lang w:val="en-GB"/>
-        </w:rPr>
-        <w:t>be applied</w:t>
-      </w:r>
-      <w:proofErr w:type="gramEnd"/>
-      <w:r>
-        <w:rPr>
-          <w:lang w:val="en-GB"/>
-        </w:rPr>
-        <w:t>. Following up with the current timeline trough out the Master Thesis using milestones and the outline of the chapters which are partly based on the project 1 and 2.</w:t>
+        <w:t xml:space="preserve">. Following up with the current timeline </w:t>
+      </w:r>
+      <w:r>
+        <w:rPr>
+          <w:lang w:val="en-GB"/>
+        </w:rPr>
+        <w:t xml:space="preserve">throughout </w:t>
+      </w:r>
+      <w:r>
+        <w:rPr>
+          <w:lang w:val="en-GB"/>
+        </w:rPr>
+        <w:t>the Master Thesis using milestones and the outline of the chapters</w:t>
+      </w:r>
+      <w:r>
+        <w:rPr>
+          <w:lang w:val="en-GB"/>
+        </w:rPr>
+        <w:t>,</w:t>
+      </w:r>
+      <w:r>
+        <w:rPr>
+          <w:lang w:val="en-GB"/>
+        </w:rPr>
+        <w:t xml:space="preserve"> which are partly based on the project 1 and 2.</w:t>
       </w:r>
     </w:p>
     <w:p>
@@ -367,21 +415,7 @@
         <w:rPr>
           <w:lang w:val="en-GB"/>
         </w:rPr>
-        <w:t xml:space="preserve">Development and improvement of the report described in Project 1, including the development of </w:t>
-      </w:r>
-      <w:proofErr w:type="gramStart"/>
-      <w:r>
-        <w:rPr>
-          <w:lang w:val="en-GB"/>
-        </w:rPr>
-        <w:t>several</w:t>
-      </w:r>
-      <w:proofErr w:type="gramEnd"/>
-      <w:r>
-        <w:rPr>
-          <w:lang w:val="en-GB"/>
-        </w:rPr>
-        <w:t xml:space="preserve"> simplified visualisations.</w:t>
+        <w:t>Development and improvement of the report described in Project 1, including the development of several simplified visualisations.</w:t>
       </w:r>
     </w:p>
     <w:p>
@@ -453,6 +487,7 @@
         <w:rPr>
           <w:lang w:val="en-GB"/>
         </w:rPr>
+        <w:lastRenderedPageBreak/>
         <w:t>This document describes the initial structure of the Master Thesis.</w:t>
       </w:r>
     </w:p>
@@ -541,6 +576,12 @@
         </w:rPr>
         <w:t>Hypothese</w:t>
       </w:r>
+      <w:r>
+        <w:rPr>
+          <w:lang w:val="en-GB"/>
+        </w:rPr>
+        <w:t>s</w:t>
+      </w:r>
     </w:p>
     <w:p>
       <w:pPr>
@@ -558,7 +599,13 @@
         <w:rPr>
           <w:lang w:val="en-GB"/>
         </w:rPr>
-        <w:t xml:space="preserve">uestion the following hypothesis </w:t>
+        <w:t xml:space="preserve">uestion the following </w:t>
+      </w:r>
+      <w:r>
+        <w:rPr>
+          <w:lang w:val="en-GB"/>
+        </w:rPr>
+        <w:t xml:space="preserve">hypotheses </w:t>
       </w:r>
       <w:proofErr w:type="gramStart"/>
       <w:r>
@@ -662,21 +709,7 @@
         <w:rPr>
           <w:lang w:val="en-GB"/>
         </w:rPr>
-        <w:t xml:space="preserve">The research is </w:t>
-      </w:r>
-      <w:proofErr w:type="gramStart"/>
-      <w:r>
-        <w:rPr>
-          <w:lang w:val="en-GB"/>
-        </w:rPr>
-        <w:t>carried out</w:t>
-      </w:r>
-      <w:proofErr w:type="gramEnd"/>
-      <w:r>
-        <w:rPr>
-          <w:lang w:val="en-GB"/>
-        </w:rPr>
-        <w:t xml:space="preserve"> in phases. </w:t>
+        <w:t xml:space="preserve">The research is carried out in phases. </w:t>
       </w:r>
     </w:p>
     <w:p>
@@ -701,7 +734,13 @@
         <w:rPr>
           <w:lang w:val="en-GB"/>
         </w:rPr>
-        <w:t>is established</w:t>
+        <w:t>are</w:t>
+      </w:r>
+      <w:r>
+        <w:rPr>
+          <w:lang w:val="en-GB"/>
+        </w:rPr>
+        <w:t xml:space="preserve"> established</w:t>
       </w:r>
       <w:proofErr w:type="gramEnd"/>
       <w:r>
@@ -740,7 +779,19 @@
         <w:rPr>
           <w:lang w:val="en-GB"/>
         </w:rPr>
-        <w:t xml:space="preserve"> as baseline.</w:t>
+        <w:t xml:space="preserve"> as </w:t>
+      </w:r>
+      <w:r>
+        <w:rPr>
+          <w:lang w:val="en-GB"/>
+        </w:rPr>
+        <w:t xml:space="preserve">a </w:t>
+      </w:r>
+      <w:r>
+        <w:rPr>
+          <w:lang w:val="en-GB"/>
+        </w:rPr>
+        <w:t>baseline.</w:t>
       </w:r>
     </w:p>
     <w:p>
@@ -754,19 +805,23 @@
           <w:lang w:val="en-GB"/>
         </w:rPr>
       </w:pPr>
-      <w:proofErr w:type="gramStart"/>
-      <w:r>
-        <w:rPr>
-          <w:lang w:val="en-GB"/>
-        </w:rPr>
-        <w:t>During the course of</w:t>
-      </w:r>
-      <w:proofErr w:type="gramEnd"/>
-      <w:r>
-        <w:rPr>
-          <w:lang w:val="en-GB"/>
-        </w:rPr>
-        <w:t xml:space="preserve"> the project when reaching relevant phases or milestones, additional research </w:t>
+      <w:r>
+        <w:rPr>
+          <w:lang w:val="en-GB"/>
+        </w:rPr>
+        <w:t xml:space="preserve">At relevant phases or milestones during the </w:t>
+      </w:r>
+      <w:r>
+        <w:rPr>
+          <w:lang w:val="en-GB"/>
+        </w:rPr>
+        <w:t>project</w:t>
+      </w:r>
+      <w:r>
+        <w:rPr>
+          <w:lang w:val="en-GB"/>
+        </w:rPr>
+        <w:t xml:space="preserve">, additional research </w:t>
       </w:r>
       <w:proofErr w:type="gramStart"/>
       <w:r>
@@ -798,7 +853,33 @@
         <w:rPr>
           <w:lang w:val="en-GB"/>
         </w:rPr>
-        <w:t>Furthermore, after completing the first iteration, further research confirming topics for a second iteration.</w:t>
+        <w:t xml:space="preserve">Furthermore, after completing the first iteration, </w:t>
+      </w:r>
+      <w:r>
+        <w:rPr>
+          <w:lang w:val="en-GB"/>
+        </w:rPr>
+        <w:t xml:space="preserve">further research </w:t>
+      </w:r>
+      <w:proofErr w:type="gramStart"/>
+      <w:r>
+        <w:rPr>
+          <w:lang w:val="en-GB"/>
+        </w:rPr>
+        <w:t>is conducted</w:t>
+      </w:r>
+      <w:proofErr w:type="gramEnd"/>
+      <w:r>
+        <w:rPr>
+          <w:lang w:val="en-GB"/>
+        </w:rPr>
+        <w:t xml:space="preserve"> to confirm topics for a second iteration</w:t>
+      </w:r>
+      <w:r>
+        <w:rPr>
+          <w:lang w:val="en-GB"/>
+        </w:rPr>
+        <w:t>.</w:t>
       </w:r>
     </w:p>
     <w:p>
@@ -825,13 +906,7 @@
         <w:rPr>
           <w:lang w:val="en-GB"/>
         </w:rPr>
-        <w:t>The overall project management m</w:t>
-      </w:r>
-      <w:r>
-        <w:rPr>
-          <w:lang w:val="en-GB"/>
-        </w:rPr>
-        <w:t xml:space="preserve">ethods to </w:t>
+        <w:t xml:space="preserve">The following section describes the overall project management methods to </w:t>
       </w:r>
       <w:proofErr w:type="gramStart"/>
       <w:r>
@@ -845,7 +920,19 @@
         <w:rPr>
           <w:lang w:val="en-GB"/>
         </w:rPr>
-        <w:t xml:space="preserve"> during the master thesis. This does not mention all project management methods such as risk </w:t>
+        <w:t xml:space="preserve"> during</w:t>
+      </w:r>
+      <w:r>
+        <w:rPr>
+          <w:lang w:val="en-GB"/>
+        </w:rPr>
+        <w:t xml:space="preserve"> the</w:t>
+      </w:r>
+      <w:r>
+        <w:rPr>
+          <w:lang w:val="en-GB"/>
+        </w:rPr>
+        <w:t xml:space="preserve"> master thesis. This does not mention all project management methods such as risk </w:t>
       </w:r>
       <w:r>
         <w:rPr>
@@ -1001,6 +1088,7 @@
         <w:rPr>
           <w:lang w:val="en-GB"/>
         </w:rPr>
+        <w:lastRenderedPageBreak/>
         <w:t xml:space="preserve">They also provide a basis for subsequently analysing and documenting the effort required for the individual work blocks. </w:t>
       </w:r>
     </w:p>
@@ -1019,21 +1107,31 @@
         <w:rPr>
           <w:lang w:val="en-GB"/>
         </w:rPr>
-        <w:t xml:space="preserve">Weekly Meetings, Jour Fixe of </w:t>
-      </w:r>
-      <w:proofErr w:type="gramStart"/>
-      <w:r>
-        <w:rPr>
-          <w:lang w:val="en-GB"/>
-        </w:rPr>
-        <w:t>Student</w:t>
-      </w:r>
-      <w:proofErr w:type="gramEnd"/>
-      <w:r>
-        <w:rPr>
-          <w:lang w:val="en-GB"/>
-        </w:rPr>
-        <w:t xml:space="preserve"> and advisor</w:t>
+        <w:t>Weekly Meetings</w:t>
+      </w:r>
+      <w:r>
+        <w:rPr>
+          <w:lang w:val="en-GB"/>
+        </w:rPr>
+        <w:t>:</w:t>
+      </w:r>
+      <w:r>
+        <w:rPr>
+          <w:lang w:val="en-GB"/>
+        </w:rPr>
+        <w:t xml:space="preserve"> Jour Fixe </w:t>
+      </w:r>
+      <w:r>
+        <w:rPr>
+          <w:lang w:val="en-GB"/>
+        </w:rPr>
+        <w:t>between</w:t>
+      </w:r>
+      <w:r>
+        <w:rPr>
+          <w:lang w:val="en-GB"/>
+        </w:rPr>
+        <w:t xml:space="preserve"> Student and advisor</w:t>
       </w:r>
     </w:p>
     <w:p>
@@ -1069,8 +1167,31 @@
         <w:rPr>
           <w:lang w:val="en-GB"/>
         </w:rPr>
-        <w:lastRenderedPageBreak/>
-        <w:t>Topic of the meeting is:</w:t>
+        <w:t>Topic</w:t>
+      </w:r>
+      <w:r>
+        <w:rPr>
+          <w:lang w:val="en-GB"/>
+        </w:rPr>
+        <w:t>s</w:t>
+      </w:r>
+      <w:r>
+        <w:rPr>
+          <w:lang w:val="en-GB"/>
+        </w:rPr>
+        <w:t xml:space="preserve"> of the meeting </w:t>
+      </w:r>
+      <w:r>
+        <w:rPr>
+          <w:lang w:val="en-GB"/>
+        </w:rPr>
+        <w:t>are</w:t>
+      </w:r>
+      <w:r>
+        <w:rPr>
+          <w:lang w:val="en-GB"/>
+        </w:rPr>
+        <w:t>:</w:t>
       </w:r>
     </w:p>
     <w:p>
@@ -1112,33 +1233,19 @@
         <w:rPr>
           <w:lang w:val="en-GB"/>
         </w:rPr>
-        <w:t>project,</w:t>
-      </w:r>
-      <w:r>
-        <w:rPr>
-          <w:lang w:val="en-GB"/>
-        </w:rPr>
-        <w:t xml:space="preserve"> what deliverables </w:t>
-      </w:r>
-      <w:proofErr w:type="gramStart"/>
-      <w:r>
-        <w:rPr>
-          <w:lang w:val="en-GB"/>
-        </w:rPr>
-        <w:t xml:space="preserve">are </w:t>
-      </w:r>
-      <w:r>
-        <w:rPr>
-          <w:lang w:val="en-GB"/>
-        </w:rPr>
-        <w:t>done</w:t>
-      </w:r>
-      <w:proofErr w:type="gramEnd"/>
-      <w:r>
-        <w:rPr>
-          <w:lang w:val="en-GB"/>
-        </w:rPr>
-        <w:t>.</w:t>
+        <w:t>project</w:t>
+      </w:r>
+      <w:r>
+        <w:rPr>
+          <w:lang w:val="en-GB"/>
+        </w:rPr>
+        <w:t xml:space="preserve">s topic as a </w:t>
+      </w:r>
+      <w:r>
+        <w:rPr>
+          <w:lang w:val="en-GB"/>
+        </w:rPr>
+        <w:t>refresh.</w:t>
       </w:r>
     </w:p>
     <w:p>
@@ -1156,13 +1263,33 @@
         <w:rPr>
           <w:lang w:val="en-GB"/>
         </w:rPr>
-        <w:t xml:space="preserve">Which Deliverable am I working </w:t>
-      </w:r>
-      <w:r>
-        <w:rPr>
-          <w:lang w:val="en-GB"/>
-        </w:rPr>
-        <w:t>on?</w:t>
+        <w:t xml:space="preserve">Check-in </w:t>
+      </w:r>
+      <w:r>
+        <w:rPr>
+          <w:lang w:val="en-GB"/>
+        </w:rPr>
+        <w:t xml:space="preserve">what deliverables </w:t>
+      </w:r>
+      <w:proofErr w:type="gramStart"/>
+      <w:r>
+        <w:rPr>
+          <w:lang w:val="en-GB"/>
+        </w:rPr>
+        <w:t xml:space="preserve">are </w:t>
+      </w:r>
+      <w:r>
+        <w:rPr>
+          <w:lang w:val="en-GB"/>
+        </w:rPr>
+        <w:t>done</w:t>
+      </w:r>
+      <w:proofErr w:type="gramEnd"/>
+      <w:r>
+        <w:rPr>
+          <w:lang w:val="en-GB"/>
+        </w:rPr>
+        <w:t>.</w:t>
       </w:r>
     </w:p>
     <w:p>
@@ -1180,7 +1307,25 @@
         <w:rPr>
           <w:lang w:val="en-GB"/>
         </w:rPr>
-        <w:t>State of the Deliverable</w:t>
+        <w:t xml:space="preserve">Which </w:t>
+      </w:r>
+      <w:r>
+        <w:rPr>
+          <w:lang w:val="en-GB"/>
+        </w:rPr>
+        <w:t>d</w:t>
+      </w:r>
+      <w:r>
+        <w:rPr>
+          <w:lang w:val="en-GB"/>
+        </w:rPr>
+        <w:t xml:space="preserve">eliverable am I working </w:t>
+      </w:r>
+      <w:r>
+        <w:rPr>
+          <w:lang w:val="en-GB"/>
+        </w:rPr>
+        <w:t>on?</w:t>
       </w:r>
     </w:p>
     <w:p>
@@ -1198,7 +1343,31 @@
         <w:rPr>
           <w:lang w:val="en-GB"/>
         </w:rPr>
-        <w:t>Next Steps</w:t>
+        <w:t>Stat</w:t>
+      </w:r>
+      <w:r>
+        <w:rPr>
+          <w:lang w:val="en-GB"/>
+        </w:rPr>
+        <w:t>us</w:t>
+      </w:r>
+      <w:r>
+        <w:rPr>
+          <w:lang w:val="en-GB"/>
+        </w:rPr>
+        <w:t xml:space="preserve"> of the </w:t>
+      </w:r>
+      <w:r>
+        <w:rPr>
+          <w:lang w:val="en-GB"/>
+        </w:rPr>
+        <w:t>d</w:t>
+      </w:r>
+      <w:r>
+        <w:rPr>
+          <w:lang w:val="en-GB"/>
+        </w:rPr>
+        <w:t>eliverable</w:t>
       </w:r>
     </w:p>
     <w:p>
@@ -1216,6 +1385,36 @@
         <w:rPr>
           <w:lang w:val="en-GB"/>
         </w:rPr>
+        <w:t xml:space="preserve">Next </w:t>
+      </w:r>
+      <w:r>
+        <w:rPr>
+          <w:lang w:val="en-GB"/>
+        </w:rPr>
+        <w:t>s</w:t>
+      </w:r>
+      <w:r>
+        <w:rPr>
+          <w:lang w:val="en-GB"/>
+        </w:rPr>
+        <w:t>teps</w:t>
+      </w:r>
+    </w:p>
+    <w:p>
+      <w:pPr>
+        <w:pStyle w:val="Listenabsatz"/>
+        <w:numPr>
+          <w:ilvl w:val="2"/>
+          <w:numId w:val="6"/>
+        </w:numPr>
+        <w:rPr>
+          <w:lang w:val="en-GB"/>
+        </w:rPr>
+      </w:pPr>
+      <w:r>
+        <w:rPr>
+          <w:lang w:val="en-GB"/>
+        </w:rPr>
         <w:t>Other</w:t>
       </w:r>
     </w:p>
@@ -1234,7 +1433,7 @@
         <w:rPr>
           <w:lang w:val="en-GB"/>
         </w:rPr>
-        <w:t xml:space="preserve">Uppon reaching milestones or other specific dates, the topics can </w:t>
+        <w:t xml:space="preserve">Upon reaching milestones or other specific dates, the topics can </w:t>
       </w:r>
       <w:r>
         <w:rPr>
@@ -1258,7 +1457,19 @@
         <w:rPr>
           <w:lang w:val="en-GB"/>
         </w:rPr>
-        <w:t xml:space="preserve">The expert has </w:t>
+        <w:t>T</w:t>
+      </w:r>
+      <w:r>
+        <w:rPr>
+          <w:lang w:val="en-GB"/>
+        </w:rPr>
+        <w:t>he</w:t>
+      </w:r>
+      <w:r>
+        <w:rPr>
+          <w:lang w:val="en-GB"/>
+        </w:rPr>
+        <w:t xml:space="preserve"> expert has </w:t>
       </w:r>
       <w:proofErr w:type="gramStart"/>
       <w:r>
@@ -1272,13 +1483,13 @@
         <w:rPr>
           <w:lang w:val="en-GB"/>
         </w:rPr>
-        <w:t xml:space="preserve"> to the meeting as </w:t>
-      </w:r>
-      <w:r>
-        <w:rPr>
-          <w:lang w:val="en-GB"/>
-        </w:rPr>
-        <w:t>optional.</w:t>
+        <w:t xml:space="preserve"> to attend the meetings on an optional basis</w:t>
+      </w:r>
+      <w:r>
+        <w:rPr>
+          <w:lang w:val="en-GB"/>
+        </w:rPr>
+        <w:t>.</w:t>
       </w:r>
     </w:p>
     <w:p>
@@ -1338,7 +1549,19 @@
         <w:rPr>
           <w:lang w:val="en-GB"/>
         </w:rPr>
-        <w:t xml:space="preserve"> Every uneven week number sprints start and end.</w:t>
+        <w:t xml:space="preserve"> Every uneven</w:t>
+      </w:r>
+      <w:r>
+        <w:rPr>
+          <w:lang w:val="en-GB"/>
+        </w:rPr>
+        <w:t xml:space="preserve"> calendar</w:t>
+      </w:r>
+      <w:r>
+        <w:rPr>
+          <w:lang w:val="en-GB"/>
+        </w:rPr>
+        <w:t xml:space="preserve"> week number sprints start and end.</w:t>
       </w:r>
     </w:p>
     <w:p>
@@ -1452,26 +1675,7 @@
         <w:rPr>
           <w:lang w:val="en-GB"/>
         </w:rPr>
-        <w:t xml:space="preserve"> to present and discuss the progress of the Master Thesis.</w:t>
-      </w:r>
-      <w:r>
-        <w:rPr>
-          <w:lang w:val="en-GB"/>
-        </w:rPr>
-        <w:br/>
-        <w:t xml:space="preserve">f. </w:t>
-      </w:r>
-      <w:r>
-        <w:rPr>
-          <w:lang w:val="en-GB"/>
-        </w:rPr>
-        <w:t>Scrum.</w:t>
-      </w:r>
-      <w:r>
-        <w:rPr>
-          <w:lang w:val="en-GB"/>
-        </w:rPr>
-        <w:t xml:space="preserve"> </w:t>
+        <w:t xml:space="preserve"> to present and discuss the progress of the Master Thesis. </w:t>
       </w:r>
     </w:p>
     <w:p>
@@ -1495,8 +1699,13 @@
         <w:rPr>
           <w:lang w:val="en-GB"/>
         </w:rPr>
-        <w:br/>
-        <w:t xml:space="preserve">g. Within the academic team, retrospectives </w:t>
+        <w:t xml:space="preserve"> </w:t>
+      </w:r>
+      <w:r>
+        <w:rPr>
+          <w:lang w:val="en-GB"/>
+        </w:rPr>
+        <w:t xml:space="preserve">Within the academic team, retrospectives </w:t>
       </w:r>
       <w:proofErr w:type="gramStart"/>
       <w:r>
@@ -1556,113 +1765,131 @@
         <w:rPr>
           <w:lang w:val="en-GB"/>
         </w:rPr>
+        <w:t xml:space="preserve">phases </w:t>
+      </w:r>
+      <w:r>
+        <w:rPr>
+          <w:lang w:val="en-GB"/>
+        </w:rPr>
+        <w:t>define</w:t>
+      </w:r>
+      <w:r>
+        <w:rPr>
+          <w:lang w:val="en-GB"/>
+        </w:rPr>
+        <w:t xml:space="preserve"> blocks which can </w:t>
+      </w:r>
+      <w:proofErr w:type="gramStart"/>
+      <w:r>
+        <w:rPr>
+          <w:lang w:val="en-GB"/>
+        </w:rPr>
+        <w:t>be closed</w:t>
+      </w:r>
+      <w:proofErr w:type="gramEnd"/>
+      <w:r>
+        <w:rPr>
+          <w:lang w:val="en-GB"/>
+        </w:rPr>
+        <w:t xml:space="preserve"> after completing each </w:t>
+      </w:r>
+      <w:r>
+        <w:rPr>
+          <w:lang w:val="en-GB"/>
+        </w:rPr>
+        <w:t>of them</w:t>
+      </w:r>
+      <w:r>
+        <w:rPr>
+          <w:lang w:val="en-GB"/>
+        </w:rPr>
+        <w:t xml:space="preserve">. The conclusion and start of each </w:t>
+      </w:r>
+      <w:r>
+        <w:rPr>
+          <w:lang w:val="en-GB"/>
+        </w:rPr>
         <w:t>phase</w:t>
       </w:r>
       <w:r>
         <w:rPr>
           <w:lang w:val="en-GB"/>
         </w:rPr>
-        <w:t xml:space="preserve"> are defining blocks which can </w:t>
+        <w:t xml:space="preserve"> </w:t>
       </w:r>
       <w:proofErr w:type="gramStart"/>
       <w:r>
         <w:rPr>
           <w:lang w:val="en-GB"/>
         </w:rPr>
-        <w:t>be closed</w:t>
+        <w:t>are</w:t>
+      </w:r>
+      <w:r>
+        <w:rPr>
+          <w:lang w:val="en-GB"/>
+        </w:rPr>
+        <w:t xml:space="preserve"> used</w:t>
       </w:r>
       <w:proofErr w:type="gramEnd"/>
       <w:r>
         <w:rPr>
           <w:lang w:val="en-GB"/>
         </w:rPr>
-        <w:t xml:space="preserve"> after completing each and move on. The conclusion and start of each </w:t>
-      </w:r>
-      <w:r>
-        <w:rPr>
-          <w:lang w:val="en-GB"/>
-        </w:rPr>
-        <w:t>phase</w:t>
-      </w:r>
-      <w:r>
-        <w:rPr>
-          <w:lang w:val="en-GB"/>
-        </w:rPr>
-        <w:t xml:space="preserve"> </w:t>
+        <w:t xml:space="preserve"> to review and adapt the current state.</w:t>
+      </w:r>
+    </w:p>
+    <w:p>
+      <w:pPr>
+        <w:rPr>
+          <w:lang w:val="en-GB"/>
+        </w:rPr>
+      </w:pPr>
+      <w:r>
+        <w:rPr>
+          <w:lang w:val="en-GB"/>
+        </w:rPr>
+        <w:t xml:space="preserve">The milestones are events </w:t>
       </w:r>
       <w:proofErr w:type="gramStart"/>
       <w:r>
         <w:rPr>
           <w:lang w:val="en-GB"/>
         </w:rPr>
-        <w:t>are</w:t>
-      </w:r>
-      <w:r>
-        <w:rPr>
-          <w:lang w:val="en-GB"/>
-        </w:rPr>
-        <w:t xml:space="preserve"> used</w:t>
+        <w:t>during the course of</w:t>
       </w:r>
       <w:proofErr w:type="gramEnd"/>
       <w:r>
         <w:rPr>
           <w:lang w:val="en-GB"/>
         </w:rPr>
-        <w:t xml:space="preserve"> to review and adapt the current state.</w:t>
-      </w:r>
-    </w:p>
-    <w:p>
-      <w:pPr>
-        <w:rPr>
-          <w:lang w:val="en-GB"/>
-        </w:rPr>
-      </w:pPr>
-      <w:r>
-        <w:rPr>
-          <w:lang w:val="en-GB"/>
-        </w:rPr>
-        <w:t xml:space="preserve">The milestones are events </w:t>
+        <w:t xml:space="preserve"> the phases. Each milestone will </w:t>
       </w:r>
       <w:proofErr w:type="gramStart"/>
       <w:r>
         <w:rPr>
           <w:lang w:val="en-GB"/>
         </w:rPr>
-        <w:t>during the course of</w:t>
+        <w:t>be documented</w:t>
       </w:r>
       <w:proofErr w:type="gramEnd"/>
       <w:r>
         <w:rPr>
           <w:lang w:val="en-GB"/>
         </w:rPr>
-        <w:t xml:space="preserve"> the phases. Each milestone will </w:t>
+        <w:t xml:space="preserve"> if it has </w:t>
       </w:r>
       <w:proofErr w:type="gramStart"/>
       <w:r>
         <w:rPr>
           <w:lang w:val="en-GB"/>
         </w:rPr>
-        <w:t>be documented</w:t>
+        <w:t>been reached</w:t>
       </w:r>
       <w:proofErr w:type="gramEnd"/>
       <w:r>
         <w:rPr>
           <w:lang w:val="en-GB"/>
         </w:rPr>
-        <w:t xml:space="preserve"> if it has </w:t>
-      </w:r>
-      <w:proofErr w:type="gramStart"/>
-      <w:r>
-        <w:rPr>
-          <w:lang w:val="en-GB"/>
-        </w:rPr>
-        <w:t>been reached</w:t>
-      </w:r>
-      <w:proofErr w:type="gramEnd"/>
-      <w:r>
-        <w:rPr>
-          <w:lang w:val="en-GB"/>
-        </w:rPr>
         <w:t xml:space="preserve"> in time. </w:t>
       </w:r>
       <w:r>
@@ -1675,7 +1902,19 @@
         <w:rPr>
           <w:lang w:val="en-GB"/>
         </w:rPr>
-        <w:t xml:space="preserve"> any adaptions required to the milestone plans </w:t>
+        <w:t xml:space="preserve"> any </w:t>
+      </w:r>
+      <w:r>
+        <w:rPr>
+          <w:lang w:val="en-GB"/>
+        </w:rPr>
+        <w:t xml:space="preserve">adaptations </w:t>
+      </w:r>
+      <w:r>
+        <w:rPr>
+          <w:lang w:val="en-GB"/>
+        </w:rPr>
+        <w:t xml:space="preserve">required to the milestone plans </w:t>
       </w:r>
       <w:proofErr w:type="gramStart"/>
       <w:r>
@@ -2045,6 +2284,7 @@
         <w:rPr>
           <w:lang w:val="en-GB"/>
         </w:rPr>
+        <w:lastRenderedPageBreak/>
         <w:t xml:space="preserve">Adapt M2 based on the findings from </w:t>
       </w:r>
       <w:r>
@@ -2177,7 +2417,6 @@
           <w:bCs/>
           <w:lang w:val="en-GB"/>
         </w:rPr>
-        <w:lastRenderedPageBreak/>
         <w:t xml:space="preserve">Milestone 3, Error documentation by stakeholders </w:t>
       </w:r>
       <w:r>
@@ -2465,7 +2704,7 @@
         <w:rPr>
           <w:lang w:val="en-GB"/>
         </w:rPr>
-        <w:t>Develop the first/basic implementation.</w:t>
+        <w:t>Develop the data retrieval from AWS source.</w:t>
       </w:r>
     </w:p>
     <w:p>
@@ -2487,15 +2726,87 @@
           <w:bCs/>
           <w:lang w:val="en-GB"/>
         </w:rPr>
-        <w:t xml:space="preserve">Milestone 5, MVP has been </w:t>
-      </w:r>
-      <w:r>
+        <w:t>Milestone 5, Data retrievable from source</w:t>
+      </w:r>
+    </w:p>
+    <w:p>
+      <w:pPr>
+        <w:pStyle w:val="Listenabsatz"/>
+        <w:numPr>
+          <w:ilvl w:val="1"/>
+          <w:numId w:val="12"/>
+        </w:numPr>
+        <w:rPr>
+          <w:lang w:val="en-GB"/>
+        </w:rPr>
+      </w:pPr>
+      <w:r>
+        <w:rPr>
+          <w:lang w:val="en-GB"/>
+        </w:rPr>
+        <w:t>Develop the first/basic implementation.</w:t>
+      </w:r>
+    </w:p>
+    <w:p>
+      <w:pPr>
+        <w:pStyle w:val="Listenabsatz"/>
+        <w:numPr>
+          <w:ilvl w:val="2"/>
+          <w:numId w:val="12"/>
+        </w:numPr>
         <w:rPr>
           <w:b/>
           <w:bCs/>
           <w:lang w:val="en-GB"/>
         </w:rPr>
-        <w:t>setup.</w:t>
+      </w:pPr>
+      <w:r>
+        <w:rPr>
+          <w:b/>
+          <w:bCs/>
+          <w:lang w:val="en-GB"/>
+        </w:rPr>
+        <w:t xml:space="preserve">Milestone </w:t>
+      </w:r>
+      <w:r>
+        <w:rPr>
+          <w:b/>
+          <w:bCs/>
+          <w:lang w:val="en-GB"/>
+        </w:rPr>
+        <w:t>6</w:t>
+      </w:r>
+      <w:r>
+        <w:rPr>
+          <w:b/>
+          <w:bCs/>
+          <w:lang w:val="en-GB"/>
+        </w:rPr>
+        <w:t xml:space="preserve">, MVP has been </w:t>
+      </w:r>
+      <w:r>
+        <w:rPr>
+          <w:b/>
+          <w:bCs/>
+          <w:lang w:val="en-GB"/>
+        </w:rPr>
+        <w:t>set</w:t>
+      </w:r>
+      <w:r>
+        <w:rPr>
+          <w:b/>
+          <w:bCs/>
+          <w:lang w:val="en-GB"/>
+        </w:rPr>
+        <w:t xml:space="preserve"> </w:t>
+      </w:r>
+      <w:r>
+        <w:rPr>
+          <w:b/>
+          <w:bCs/>
+          <w:lang w:val="en-GB"/>
+        </w:rPr>
+        <w:t>up.</w:t>
       </w:r>
     </w:p>
     <w:p>
@@ -2535,7 +2846,7 @@
           <w:bCs/>
           <w:lang w:val="en-GB"/>
         </w:rPr>
-        <w:t>Milestone 6, MVP presented to</w:t>
+        <w:t xml:space="preserve">Milestone </w:t>
       </w:r>
       <w:r>
         <w:rPr>
@@ -2543,7 +2854,7 @@
           <w:bCs/>
           <w:lang w:val="en-GB"/>
         </w:rPr>
-        <w:t xml:space="preserve"> Post</w:t>
+        <w:t>7</w:t>
       </w:r>
       <w:r>
         <w:rPr>
@@ -2551,7 +2862,7 @@
           <w:bCs/>
           <w:lang w:val="en-GB"/>
         </w:rPr>
-        <w:t xml:space="preserve"> </w:t>
+        <w:t>, MVP presented to</w:t>
       </w:r>
       <w:r>
         <w:rPr>
@@ -2559,6 +2870,22 @@
           <w:bCs/>
           <w:lang w:val="en-GB"/>
         </w:rPr>
+        <w:t xml:space="preserve"> Post</w:t>
+      </w:r>
+      <w:r>
+        <w:rPr>
+          <w:b/>
+          <w:bCs/>
+          <w:lang w:val="en-GB"/>
+        </w:rPr>
+        <w:t xml:space="preserve"> </w:t>
+      </w:r>
+      <w:r>
+        <w:rPr>
+          <w:b/>
+          <w:bCs/>
+          <w:lang w:val="en-GB"/>
+        </w:rPr>
         <w:t>stakeholders.</w:t>
       </w:r>
     </w:p>
@@ -2801,7 +3128,7 @@
           <w:bCs/>
           <w:lang w:val="en-GB"/>
         </w:rPr>
-        <w:t xml:space="preserve">Milestone 7, Outline of second iteration </w:t>
+        <w:t xml:space="preserve">Milestone </w:t>
       </w:r>
       <w:r>
         <w:rPr>
@@ -2809,6 +3136,22 @@
           <w:bCs/>
           <w:lang w:val="en-GB"/>
         </w:rPr>
+        <w:t>8</w:t>
+      </w:r>
+      <w:r>
+        <w:rPr>
+          <w:b/>
+          <w:bCs/>
+          <w:lang w:val="en-GB"/>
+        </w:rPr>
+        <w:t xml:space="preserve">, Outline of second iteration </w:t>
+      </w:r>
+      <w:r>
+        <w:rPr>
+          <w:b/>
+          <w:bCs/>
+          <w:lang w:val="en-GB"/>
+        </w:rPr>
         <w:t>defined.</w:t>
       </w:r>
     </w:p>
@@ -3009,7 +3352,7 @@
           <w:bCs/>
           <w:lang w:val="en-GB"/>
         </w:rPr>
-        <w:t xml:space="preserve">Milestone 8, Data of different approaches </w:t>
+        <w:t xml:space="preserve">Milestone </w:t>
       </w:r>
       <w:r>
         <w:rPr>
@@ -3017,6 +3360,22 @@
           <w:bCs/>
           <w:lang w:val="en-GB"/>
         </w:rPr>
+        <w:t>9</w:t>
+      </w:r>
+      <w:r>
+        <w:rPr>
+          <w:b/>
+          <w:bCs/>
+          <w:lang w:val="en-GB"/>
+        </w:rPr>
+        <w:t xml:space="preserve">, Data of different approaches </w:t>
+      </w:r>
+      <w:r>
+        <w:rPr>
+          <w:b/>
+          <w:bCs/>
+          <w:lang w:val="en-GB"/>
+        </w:rPr>
         <w:t>compared.</w:t>
       </w:r>
     </w:p>
@@ -3035,6 +3394,7 @@
         <w:rPr>
           <w:lang w:val="en-GB"/>
         </w:rPr>
+        <w:lastRenderedPageBreak/>
         <w:t>Identify factors that may limit a direct or fair comparison, including specific differences between the approaches.</w:t>
       </w:r>
     </w:p>
@@ -3131,7 +3491,7 @@
           <w:bCs/>
           <w:lang w:val="en-GB"/>
         </w:rPr>
-        <w:t xml:space="preserve">Milestone 9, Thesis document </w:t>
+        <w:t xml:space="preserve">Milestone </w:t>
       </w:r>
       <w:r>
         <w:rPr>
@@ -3139,6 +3499,22 @@
           <w:bCs/>
           <w:lang w:val="en-GB"/>
         </w:rPr>
+        <w:t>10</w:t>
+      </w:r>
+      <w:r>
+        <w:rPr>
+          <w:b/>
+          <w:bCs/>
+          <w:lang w:val="en-GB"/>
+        </w:rPr>
+        <w:t xml:space="preserve">, Thesis document </w:t>
+      </w:r>
+      <w:r>
+        <w:rPr>
+          <w:b/>
+          <w:bCs/>
+          <w:lang w:val="en-GB"/>
+        </w:rPr>
         <w:t>completed.</w:t>
       </w:r>
     </w:p>
@@ -3205,7 +3581,6 @@
         <w:rPr>
           <w:lang w:val="en-GB"/>
         </w:rPr>
-        <w:lastRenderedPageBreak/>
         <w:t>Presentation</w:t>
       </w:r>
       <w:r>
@@ -3234,7 +3609,23 @@
           <w:bCs/>
           <w:lang w:val="en-GB"/>
         </w:rPr>
-        <w:t>Milestone 10, Presentation ready</w:t>
+        <w:t>Milestone 1</w:t>
+      </w:r>
+      <w:r>
+        <w:rPr>
+          <w:b/>
+          <w:bCs/>
+          <w:lang w:val="en-GB"/>
+        </w:rPr>
+        <w:t>1</w:t>
+      </w:r>
+      <w:r>
+        <w:rPr>
+          <w:b/>
+          <w:bCs/>
+          <w:lang w:val="en-GB"/>
+        </w:rPr>
+        <w:t>, Presentation ready</w:t>
       </w:r>
     </w:p>
     <w:p>
@@ -3472,7 +3863,7 @@
         <w:rPr>
           <w:lang w:val="en-GB"/>
         </w:rPr>
-        <w:t>Milestone 5, MVP has been setup.</w:t>
+        <w:t>Milestone 5, Data retrievable from source</w:t>
       </w:r>
     </w:p>
     <w:p>
@@ -3490,13 +3881,7 @@
         <w:rPr>
           <w:lang w:val="en-GB"/>
         </w:rPr>
-        <w:t>21</w:t>
-      </w:r>
-      <w:r>
-        <w:rPr>
-          <w:lang w:val="en-GB"/>
-        </w:rPr>
-        <w:t>.03.2027</w:t>
+        <w:t>24.01.2027</w:t>
       </w:r>
     </w:p>
     <w:p>
@@ -3514,7 +3899,31 @@
         <w:rPr>
           <w:lang w:val="en-GB"/>
         </w:rPr>
-        <w:t>Milestone 6, MVP presented to Post stakeholders.</w:t>
+        <w:t xml:space="preserve">Milestone </w:t>
+      </w:r>
+      <w:r>
+        <w:rPr>
+          <w:lang w:val="en-GB"/>
+        </w:rPr>
+        <w:t>6</w:t>
+      </w:r>
+      <w:r>
+        <w:rPr>
+          <w:lang w:val="en-GB"/>
+        </w:rPr>
+        <w:t>, MVP has been set</w:t>
+      </w:r>
+      <w:r>
+        <w:rPr>
+          <w:lang w:val="en-GB"/>
+        </w:rPr>
+        <w:t xml:space="preserve"> </w:t>
+      </w:r>
+      <w:r>
+        <w:rPr>
+          <w:lang w:val="en-GB"/>
+        </w:rPr>
+        <w:t>up.</w:t>
       </w:r>
     </w:p>
     <w:p>
@@ -3532,7 +3941,13 @@
         <w:rPr>
           <w:lang w:val="en-GB"/>
         </w:rPr>
-        <w:t>04.04.2027</w:t>
+        <w:t>21</w:t>
+      </w:r>
+      <w:r>
+        <w:rPr>
+          <w:lang w:val="en-GB"/>
+        </w:rPr>
+        <w:t>.03.2027</w:t>
       </w:r>
     </w:p>
     <w:p>
@@ -3550,7 +3965,19 @@
         <w:rPr>
           <w:lang w:val="en-GB"/>
         </w:rPr>
-        <w:t>Milestone 7, Outline of second iteration defined.</w:t>
+        <w:t xml:space="preserve">Milestone </w:t>
+      </w:r>
+      <w:r>
+        <w:rPr>
+          <w:lang w:val="en-GB"/>
+        </w:rPr>
+        <w:t>7</w:t>
+      </w:r>
+      <w:r>
+        <w:rPr>
+          <w:lang w:val="en-GB"/>
+        </w:rPr>
+        <w:t>, MVP presented to Post stakeholders.</w:t>
       </w:r>
     </w:p>
     <w:p>
@@ -3568,7 +3995,7 @@
         <w:rPr>
           <w:lang w:val="en-GB"/>
         </w:rPr>
-        <w:t>18.04.2027</w:t>
+        <w:t>04.04.2027</w:t>
       </w:r>
     </w:p>
     <w:p>
@@ -3586,7 +4013,19 @@
         <w:rPr>
           <w:lang w:val="en-GB"/>
         </w:rPr>
-        <w:t>Milestone 8, Data of different approaches compared.</w:t>
+        <w:t xml:space="preserve">Milestone </w:t>
+      </w:r>
+      <w:r>
+        <w:rPr>
+          <w:lang w:val="en-GB"/>
+        </w:rPr>
+        <w:t>8</w:t>
+      </w:r>
+      <w:r>
+        <w:rPr>
+          <w:lang w:val="en-GB"/>
+        </w:rPr>
+        <w:t>, Outline of second iteration defined.</w:t>
       </w:r>
     </w:p>
     <w:p>
@@ -3604,7 +4043,7 @@
         <w:rPr>
           <w:lang w:val="en-GB"/>
         </w:rPr>
-        <w:t>16.05.2027</w:t>
+        <w:t>18.04.2027</w:t>
       </w:r>
     </w:p>
     <w:p>
@@ -3622,7 +4061,19 @@
         <w:rPr>
           <w:lang w:val="en-GB"/>
         </w:rPr>
-        <w:t>Milestone 9, Thesis document completed.</w:t>
+        <w:t xml:space="preserve">Milestone </w:t>
+      </w:r>
+      <w:r>
+        <w:rPr>
+          <w:lang w:val="en-GB"/>
+        </w:rPr>
+        <w:t>9</w:t>
+      </w:r>
+      <w:r>
+        <w:rPr>
+          <w:lang w:val="en-GB"/>
+        </w:rPr>
+        <w:t>, Data of different approaches compared.</w:t>
       </w:r>
     </w:p>
     <w:p>
@@ -3640,25 +4091,7 @@
         <w:rPr>
           <w:lang w:val="en-GB"/>
         </w:rPr>
-        <w:t>11</w:t>
-      </w:r>
-      <w:r>
-        <w:rPr>
-          <w:lang w:val="en-GB"/>
-        </w:rPr>
-        <w:t>.</w:t>
-      </w:r>
-      <w:r>
-        <w:rPr>
-          <w:lang w:val="en-GB"/>
-        </w:rPr>
-        <w:t>07</w:t>
-      </w:r>
-      <w:r>
-        <w:rPr>
-          <w:lang w:val="en-GB"/>
-        </w:rPr>
-        <w:t>.2027</w:t>
+        <w:t>16.05.2027</w:t>
       </w:r>
     </w:p>
     <w:p>
@@ -3676,7 +4109,19 @@
         <w:rPr>
           <w:lang w:val="en-GB"/>
         </w:rPr>
-        <w:t>Milestone 10, Presentation ready</w:t>
+        <w:t xml:space="preserve">Milestone </w:t>
+      </w:r>
+      <w:r>
+        <w:rPr>
+          <w:lang w:val="en-GB"/>
+        </w:rPr>
+        <w:t>10</w:t>
+      </w:r>
+      <w:r>
+        <w:rPr>
+          <w:lang w:val="en-GB"/>
+        </w:rPr>
+        <w:t>, Thesis document completed.</w:t>
       </w:r>
     </w:p>
     <w:p>
@@ -3694,6 +4139,72 @@
         <w:rPr>
           <w:lang w:val="en-GB"/>
         </w:rPr>
+        <w:t>11</w:t>
+      </w:r>
+      <w:r>
+        <w:rPr>
+          <w:lang w:val="en-GB"/>
+        </w:rPr>
+        <w:t>.</w:t>
+      </w:r>
+      <w:r>
+        <w:rPr>
+          <w:lang w:val="en-GB"/>
+        </w:rPr>
+        <w:t>07</w:t>
+      </w:r>
+      <w:r>
+        <w:rPr>
+          <w:lang w:val="en-GB"/>
+        </w:rPr>
+        <w:t>.2027</w:t>
+      </w:r>
+    </w:p>
+    <w:p>
+      <w:pPr>
+        <w:pStyle w:val="Listenabsatz"/>
+        <w:numPr>
+          <w:ilvl w:val="0"/>
+          <w:numId w:val="12"/>
+        </w:numPr>
+        <w:rPr>
+          <w:lang w:val="en-GB"/>
+        </w:rPr>
+      </w:pPr>
+      <w:r>
+        <w:rPr>
+          <w:lang w:val="en-GB"/>
+        </w:rPr>
+        <w:t>Milestone 1</w:t>
+      </w:r>
+      <w:r>
+        <w:rPr>
+          <w:lang w:val="en-GB"/>
+        </w:rPr>
+        <w:t>1</w:t>
+      </w:r>
+      <w:r>
+        <w:rPr>
+          <w:lang w:val="en-GB"/>
+        </w:rPr>
+        <w:t>, Presentation ready</w:t>
+      </w:r>
+    </w:p>
+    <w:p>
+      <w:pPr>
+        <w:pStyle w:val="Listenabsatz"/>
+        <w:numPr>
+          <w:ilvl w:val="1"/>
+          <w:numId w:val="12"/>
+        </w:numPr>
+        <w:rPr>
+          <w:lang w:val="en-GB"/>
+        </w:rPr>
+      </w:pPr>
+      <w:r>
+        <w:rPr>
+          <w:lang w:val="en-GB"/>
+        </w:rPr>
         <w:t>25</w:t>
       </w:r>
       <w:r>
@@ -3721,29 +4232,17 @@
           <w:lang w:val="en-GB"/>
         </w:rPr>
       </w:pPr>
-    </w:p>
-    <w:p>
-      <w:pPr>
-        <w:rPr>
-          <w:lang w:val="en-GB"/>
-        </w:rPr>
-      </w:pPr>
-    </w:p>
-    <w:p>
-      <w:pPr>
-        <w:rPr>
-          <w:lang w:val="en-GB"/>
-        </w:rPr>
-      </w:pPr>
       <w:r>
         <w:rPr>
           <w:noProof/>
-        </w:rPr>
+          <w:lang w:val="en-GB"/>
+        </w:rPr>
+        <w:lastRenderedPageBreak/>
         <w:drawing>
-          <wp:inline distT="0" distB="0" distL="0" distR="0" wp14:anchorId="5B07AEA1" wp14:editId="72D9B85E">
+          <wp:inline distT="0" distB="0" distL="0" distR="0" wp14:anchorId="26E8CBBC" wp14:editId="282109D0">
             <wp:extent cx="5760720" cy="1920240"/>
             <wp:effectExtent l="0" t="0" r="0" b="3810"/>
-            <wp:docPr id="822726782" name="Grafik 1"/>
+            <wp:docPr id="1656633353" name="Grafik 1"/>
             <wp:cNvGraphicFramePr>
               <a:graphicFrameLocks xmlns:a="http://schemas.openxmlformats.org/drawingml/2006/main" noChangeAspect="1"/>
             </wp:cNvGraphicFramePr>
@@ -3751,10 +4250,8 @@
               <a:graphicData uri="http://schemas.openxmlformats.org/drawingml/2006/picture">
                 <pic:pic xmlns:pic="http://schemas.openxmlformats.org/drawingml/2006/picture">
                   <pic:nvPicPr>
-                    <pic:cNvPr id="0" name="Picture 1"/>
-                    <pic:cNvPicPr>
-                      <a:picLocks noChangeAspect="1" noChangeArrowheads="1"/>
-                    </pic:cNvPicPr>
+                    <pic:cNvPr id="1656633353" name="Grafik 1656633353"/>
+                    <pic:cNvPicPr/>
                   </pic:nvPicPr>
                   <pic:blipFill>
                     <a:blip r:embed="rId8" cstate="print">
@@ -3764,12 +4261,11 @@
                         </a:ext>
                       </a:extLst>
                     </a:blip>
-                    <a:srcRect/>
                     <a:stretch>
                       <a:fillRect/>
                     </a:stretch>
                   </pic:blipFill>
-                  <pic:spPr bwMode="auto">
+                  <pic:spPr>
                     <a:xfrm>
                       <a:off x="0" y="0"/>
                       <a:ext cx="5760720" cy="1920240"/>
@@ -3777,10 +4273,6 @@
                     <a:prstGeom prst="rect">
                       <a:avLst/>
                     </a:prstGeom>
-                    <a:noFill/>
-                    <a:ln>
-                      <a:noFill/>
-                    </a:ln>
                   </pic:spPr>
                 </pic:pic>
               </a:graphicData>
@@ -3791,322 +4283,301 @@
     </w:p>
     <w:p>
       <w:pPr>
-        <w:rPr>
-          <w:lang w:val="en-GB"/>
-        </w:rPr>
-      </w:pPr>
-    </w:p>
-    <w:p>
-      <w:pPr>
         <w:pStyle w:val="berschrift1"/>
       </w:pPr>
       <w:r>
+        <w:t xml:space="preserve">Chapter </w:t>
+      </w:r>
+      <w:r>
+        <w:t>Structure</w:t>
+      </w:r>
+    </w:p>
+    <w:p>
+      <w:pPr>
+        <w:rPr>
+          <w:lang w:val="en-GB"/>
+        </w:rPr>
+      </w:pPr>
+      <w:r>
+        <w:rPr>
+          <w:lang w:val="en-GB"/>
+        </w:rPr>
+        <w:t>The chapter structure is a</w:t>
+      </w:r>
+      <w:r>
+        <w:rPr>
+          <w:lang w:val="en-GB"/>
+        </w:rPr>
+        <w:t xml:space="preserve"> basic outline taken from </w:t>
+      </w:r>
+      <w:r>
+        <w:rPr>
+          <w:lang w:val="en-GB"/>
+        </w:rPr>
+        <w:t>projects</w:t>
+      </w:r>
+      <w:r>
+        <w:rPr>
+          <w:lang w:val="en-GB"/>
+        </w:rPr>
+        <w:t xml:space="preserve"> 1 and 2 including additional topics for the master thesis such as the description of the milestones. Some existin content is to be [changed] or [renewed] which </w:t>
+      </w:r>
+      <w:proofErr w:type="gramStart"/>
+      <w:r>
+        <w:rPr>
+          <w:lang w:val="en-GB"/>
+        </w:rPr>
+        <w:t>is shown</w:t>
+      </w:r>
+      <w:proofErr w:type="gramEnd"/>
+      <w:r>
+        <w:rPr>
+          <w:lang w:val="en-GB"/>
+        </w:rPr>
+        <w:t xml:space="preserve"> in [brackets].</w:t>
+      </w:r>
+    </w:p>
+    <w:p>
+      <w:pPr>
+        <w:rPr>
+          <w:lang w:val="en-GB"/>
+        </w:rPr>
+      </w:pPr>
+    </w:p>
+    <w:p>
+      <w:pPr>
+        <w:rPr>
+          <w:lang w:val="en-GB"/>
+        </w:rPr>
+      </w:pPr>
+    </w:p>
+    <w:p>
+      <w:pPr>
+        <w:rPr>
+          <w:lang w:val="en-GB"/>
+        </w:rPr>
+      </w:pPr>
+      <w:r>
+        <w:rPr>
+          <w:lang w:val="en-GB"/>
+        </w:rPr>
+        <w:t>Contents</w:t>
+      </w:r>
+    </w:p>
+    <w:p>
+      <w:pPr>
+        <w:rPr>
+          <w:lang w:val="en-GB"/>
+        </w:rPr>
+      </w:pPr>
+    </w:p>
+    <w:p>
+      <w:pPr>
+        <w:rPr>
+          <w:lang w:val="en-GB"/>
+        </w:rPr>
+      </w:pPr>
+      <w:r>
+        <w:rPr>
+          <w:lang w:val="en-GB"/>
+        </w:rPr>
+        <w:t>Abstract</w:t>
+      </w:r>
+    </w:p>
+    <w:p>
+      <w:pPr>
+        <w:rPr>
+          <w:lang w:val="en-GB"/>
+        </w:rPr>
+      </w:pPr>
+    </w:p>
+    <w:p>
+      <w:pPr>
+        <w:rPr>
+          <w:lang w:val="en-GB"/>
+        </w:rPr>
+      </w:pPr>
+      <w:r>
+        <w:rPr>
+          <w:lang w:val="en-GB"/>
+        </w:rPr>
+        <w:t>1. Introduction</w:t>
+      </w:r>
+    </w:p>
+    <w:p>
+      <w:pPr>
+        <w:rPr>
+          <w:lang w:val="en-GB"/>
+        </w:rPr>
+      </w:pPr>
+      <w:r>
+        <w:rPr>
+          <w:lang w:val="en-GB"/>
+        </w:rPr>
+        <w:t xml:space="preserve">    1.1. Background</w:t>
+      </w:r>
+    </w:p>
+    <w:p>
+      <w:pPr>
+        <w:rPr>
+          <w:lang w:val="en-GB"/>
+        </w:rPr>
+      </w:pPr>
+      <w:r>
+        <w:rPr>
+          <w:lang w:val="en-GB"/>
+        </w:rPr>
+        <w:t xml:space="preserve">    1.2. Motivation</w:t>
+      </w:r>
+    </w:p>
+    <w:p>
+      <w:pPr>
+        <w:rPr>
+          <w:lang w:val="en-GB"/>
+        </w:rPr>
+      </w:pPr>
+      <w:r>
+        <w:rPr>
+          <w:lang w:val="en-GB"/>
+        </w:rPr>
+        <w:t xml:space="preserve">    1.3. Problem Statement</w:t>
+      </w:r>
+    </w:p>
+    <w:p>
+      <w:pPr>
+        <w:rPr>
+          <w:lang w:val="en-GB"/>
+        </w:rPr>
+      </w:pPr>
+      <w:r>
+        <w:rPr>
+          <w:lang w:val="en-GB"/>
+        </w:rPr>
+        <w:t xml:space="preserve">    1.4. Scope and Boundaries</w:t>
+      </w:r>
+    </w:p>
+    <w:p>
+      <w:pPr>
+        <w:rPr>
+          <w:lang w:val="en-GB"/>
+        </w:rPr>
+      </w:pPr>
+      <w:r>
+        <w:rPr>
+          <w:lang w:val="en-GB"/>
+        </w:rPr>
+        <w:t xml:space="preserve">    1.5. Expected Outcome</w:t>
+      </w:r>
+    </w:p>
+    <w:p>
+      <w:pPr>
+        <w:rPr>
+          <w:lang w:val="en-GB"/>
+        </w:rPr>
+      </w:pPr>
+      <w:r>
+        <w:rPr>
+          <w:lang w:val="en-GB"/>
+        </w:rPr>
+        <w:t xml:space="preserve">    1.6. Structure of the Document</w:t>
+      </w:r>
+    </w:p>
+    <w:p>
+      <w:pPr>
+        <w:rPr>
+          <w:lang w:val="en-GB"/>
+        </w:rPr>
+      </w:pPr>
+    </w:p>
+    <w:p>
+      <w:pPr>
+        <w:rPr>
+          <w:lang w:val="en-GB"/>
+        </w:rPr>
+      </w:pPr>
+      <w:r>
+        <w:rPr>
+          <w:lang w:val="en-GB"/>
+        </w:rPr>
+        <w:t>2. Project Management</w:t>
+      </w:r>
+    </w:p>
+    <w:p>
+      <w:pPr>
+        <w:rPr>
+          <w:lang w:val="en-GB"/>
+        </w:rPr>
+      </w:pPr>
+      <w:r>
+        <w:rPr>
+          <w:lang w:val="en-GB"/>
+        </w:rPr>
+        <w:t xml:space="preserve">    2.1. Team Constellation</w:t>
+      </w:r>
+    </w:p>
+    <w:p>
+      <w:pPr>
+        <w:rPr>
+          <w:lang w:val="en-GB"/>
+        </w:rPr>
+      </w:pPr>
+      <w:r>
+        <w:rPr>
+          <w:lang w:val="en-GB"/>
+        </w:rPr>
+        <w:t xml:space="preserve">    2.2. Project Management Methodologies</w:t>
+      </w:r>
+    </w:p>
+    <w:p>
+      <w:pPr>
+        <w:rPr>
+          <w:lang w:val="en-GB"/>
+        </w:rPr>
+      </w:pPr>
+      <w:r>
+        <w:rPr>
+          <w:lang w:val="en-GB"/>
+        </w:rPr>
+        <w:t xml:space="preserve">        2.2.1. Agile and Iterative Approach [CHANGED]</w:t>
+      </w:r>
+    </w:p>
+    <w:p>
+      <w:pPr>
+        <w:rPr>
+          <w:lang w:val="en-GB"/>
+        </w:rPr>
+      </w:pPr>
+      <w:r>
+        <w:rPr>
+          <w:lang w:val="en-GB"/>
+        </w:rPr>
+        <w:t xml:space="preserve">        2.2.2. Project Plan and Work Packages [NEW]</w:t>
+      </w:r>
+    </w:p>
+    <w:p>
+      <w:pPr>
+        <w:rPr>
+          <w:lang w:val="en-GB"/>
+        </w:rPr>
+      </w:pPr>
+      <w:r>
+        <w:rPr>
+          <w:lang w:val="en-GB"/>
+        </w:rPr>
+        <w:t xml:space="preserve">        2.2.3. Milestones [CHANGED]</w:t>
+      </w:r>
+    </w:p>
+    <w:p>
+      <w:pPr>
+        <w:rPr>
+          <w:lang w:val="en-GB"/>
+        </w:rPr>
+      </w:pPr>
+      <w:r>
+        <w:rPr>
+          <w:lang w:val="en-GB"/>
+        </w:rPr>
         <w:lastRenderedPageBreak/>
-        <w:t xml:space="preserve">Chapter </w:t>
-      </w:r>
-      <w:r>
-        <w:t>Structure</w:t>
-      </w:r>
-    </w:p>
-    <w:p>
-      <w:pPr>
-        <w:rPr>
-          <w:lang w:val="en-GB"/>
-        </w:rPr>
-      </w:pPr>
-      <w:r>
-        <w:rPr>
-          <w:lang w:val="en-GB"/>
-        </w:rPr>
-        <w:t>The chapter structure is a</w:t>
-      </w:r>
-      <w:r>
-        <w:rPr>
-          <w:lang w:val="en-GB"/>
-        </w:rPr>
-        <w:t xml:space="preserve"> basic outline taken from </w:t>
-      </w:r>
-      <w:r>
-        <w:rPr>
-          <w:lang w:val="en-GB"/>
-        </w:rPr>
-        <w:t>projects</w:t>
-      </w:r>
-      <w:r>
-        <w:rPr>
-          <w:lang w:val="en-GB"/>
-        </w:rPr>
-        <w:t xml:space="preserve"> 1 and 2 including additional topics for the master thesis such as the description of the milestones. </w:t>
-      </w:r>
-      <w:proofErr w:type="gramStart"/>
-      <w:r>
-        <w:rPr>
-          <w:lang w:val="en-GB"/>
-        </w:rPr>
-        <w:t>Some</w:t>
-      </w:r>
-      <w:proofErr w:type="gramEnd"/>
-      <w:r>
-        <w:rPr>
-          <w:lang w:val="en-GB"/>
-        </w:rPr>
-        <w:t xml:space="preserve"> existin content is to be [changed] or [renewed] which </w:t>
-      </w:r>
-      <w:proofErr w:type="gramStart"/>
-      <w:r>
-        <w:rPr>
-          <w:lang w:val="en-GB"/>
-        </w:rPr>
-        <w:t>is shown</w:t>
-      </w:r>
-      <w:proofErr w:type="gramEnd"/>
-      <w:r>
-        <w:rPr>
-          <w:lang w:val="en-GB"/>
-        </w:rPr>
-        <w:t xml:space="preserve"> in [brackets].</w:t>
-      </w:r>
-    </w:p>
-    <w:p>
-      <w:pPr>
-        <w:rPr>
-          <w:lang w:val="en-GB"/>
-        </w:rPr>
-      </w:pPr>
-    </w:p>
-    <w:p>
-      <w:pPr>
-        <w:rPr>
-          <w:lang w:val="en-GB"/>
-        </w:rPr>
-      </w:pPr>
-    </w:p>
-    <w:p>
-      <w:pPr>
-        <w:rPr>
-          <w:lang w:val="en-GB"/>
-        </w:rPr>
-      </w:pPr>
-      <w:r>
-        <w:rPr>
-          <w:lang w:val="en-GB"/>
-        </w:rPr>
-        <w:t>Contents</w:t>
-      </w:r>
-    </w:p>
-    <w:p>
-      <w:pPr>
-        <w:rPr>
-          <w:lang w:val="en-GB"/>
-        </w:rPr>
-      </w:pPr>
-    </w:p>
-    <w:p>
-      <w:pPr>
-        <w:rPr>
-          <w:lang w:val="en-GB"/>
-        </w:rPr>
-      </w:pPr>
-      <w:r>
-        <w:rPr>
-          <w:lang w:val="en-GB"/>
-        </w:rPr>
-        <w:t>Abstract</w:t>
-      </w:r>
-    </w:p>
-    <w:p>
-      <w:pPr>
-        <w:rPr>
-          <w:lang w:val="en-GB"/>
-        </w:rPr>
-      </w:pPr>
-    </w:p>
-    <w:p>
-      <w:pPr>
-        <w:rPr>
-          <w:lang w:val="en-GB"/>
-        </w:rPr>
-      </w:pPr>
-      <w:r>
-        <w:rPr>
-          <w:lang w:val="en-GB"/>
-        </w:rPr>
-        <w:t>1. Introduction</w:t>
-      </w:r>
-    </w:p>
-    <w:p>
-      <w:pPr>
-        <w:rPr>
-          <w:lang w:val="en-GB"/>
-        </w:rPr>
-      </w:pPr>
-      <w:r>
-        <w:rPr>
-          <w:lang w:val="en-GB"/>
-        </w:rPr>
-        <w:t xml:space="preserve">    1.1. Background</w:t>
-      </w:r>
-    </w:p>
-    <w:p>
-      <w:pPr>
-        <w:rPr>
-          <w:lang w:val="en-GB"/>
-        </w:rPr>
-      </w:pPr>
-      <w:r>
-        <w:rPr>
-          <w:lang w:val="en-GB"/>
-        </w:rPr>
-        <w:t xml:space="preserve">    1.2. Motivation</w:t>
-      </w:r>
-    </w:p>
-    <w:p>
-      <w:pPr>
-        <w:rPr>
-          <w:lang w:val="en-GB"/>
-        </w:rPr>
-      </w:pPr>
-      <w:r>
-        <w:rPr>
-          <w:lang w:val="en-GB"/>
-        </w:rPr>
-        <w:t xml:space="preserve">    1.3. Problem Statement</w:t>
-      </w:r>
-    </w:p>
-    <w:p>
-      <w:pPr>
-        <w:rPr>
-          <w:lang w:val="en-GB"/>
-        </w:rPr>
-      </w:pPr>
-      <w:r>
-        <w:rPr>
-          <w:lang w:val="en-GB"/>
-        </w:rPr>
-        <w:t xml:space="preserve">    1.4. Scope and Boundaries</w:t>
-      </w:r>
-    </w:p>
-    <w:p>
-      <w:pPr>
-        <w:rPr>
-          <w:lang w:val="en-GB"/>
-        </w:rPr>
-      </w:pPr>
-      <w:r>
-        <w:rPr>
-          <w:lang w:val="en-GB"/>
-        </w:rPr>
-        <w:t xml:space="preserve">    1.5. Expected Outcome</w:t>
-      </w:r>
-    </w:p>
-    <w:p>
-      <w:pPr>
-        <w:rPr>
-          <w:lang w:val="en-GB"/>
-        </w:rPr>
-      </w:pPr>
-      <w:r>
-        <w:rPr>
-          <w:lang w:val="en-GB"/>
-        </w:rPr>
-        <w:t xml:space="preserve">    1.6. Structure of the Document</w:t>
-      </w:r>
-    </w:p>
-    <w:p>
-      <w:pPr>
-        <w:rPr>
-          <w:lang w:val="en-GB"/>
-        </w:rPr>
-      </w:pPr>
-    </w:p>
-    <w:p>
-      <w:pPr>
-        <w:rPr>
-          <w:lang w:val="en-GB"/>
-        </w:rPr>
-      </w:pPr>
-      <w:r>
-        <w:rPr>
-          <w:lang w:val="en-GB"/>
-        </w:rPr>
-        <w:t>2. Project Management</w:t>
-      </w:r>
-    </w:p>
-    <w:p>
-      <w:pPr>
-        <w:rPr>
-          <w:lang w:val="en-GB"/>
-        </w:rPr>
-      </w:pPr>
-      <w:r>
-        <w:rPr>
-          <w:lang w:val="en-GB"/>
-        </w:rPr>
-        <w:t xml:space="preserve">    2.1. Team Constellation</w:t>
-      </w:r>
-    </w:p>
-    <w:p>
-      <w:pPr>
-        <w:rPr>
-          <w:lang w:val="en-GB"/>
-        </w:rPr>
-      </w:pPr>
-      <w:r>
-        <w:rPr>
-          <w:lang w:val="en-GB"/>
-        </w:rPr>
-        <w:t xml:space="preserve">    2.2. Project Management Methodologies</w:t>
-      </w:r>
-    </w:p>
-    <w:p>
-      <w:pPr>
-        <w:rPr>
-          <w:lang w:val="en-GB"/>
-        </w:rPr>
-      </w:pPr>
-      <w:r>
-        <w:rPr>
-          <w:lang w:val="en-GB"/>
-        </w:rPr>
-        <w:t xml:space="preserve">        2.2.1. Agile and Iterative Approach [CHANGED]</w:t>
-      </w:r>
-    </w:p>
-    <w:p>
-      <w:pPr>
-        <w:rPr>
-          <w:lang w:val="en-GB"/>
-        </w:rPr>
-      </w:pPr>
-      <w:r>
-        <w:rPr>
-          <w:lang w:val="en-GB"/>
-        </w:rPr>
-        <w:t xml:space="preserve">        2.2.2. Project Plan and Work Packages [NEW]</w:t>
-      </w:r>
-    </w:p>
-    <w:p>
-      <w:pPr>
-        <w:rPr>
-          <w:lang w:val="en-GB"/>
-        </w:rPr>
-      </w:pPr>
-      <w:r>
-        <w:rPr>
-          <w:lang w:val="en-GB"/>
-        </w:rPr>
-        <w:t xml:space="preserve">        2.2.3. Milestones [CHANGED]</w:t>
-      </w:r>
-    </w:p>
-    <w:p>
-      <w:pPr>
-        <w:rPr>
-          <w:lang w:val="en-GB"/>
-        </w:rPr>
-      </w:pPr>
-      <w:r>
-        <w:rPr>
-          <w:lang w:val="en-GB"/>
-        </w:rPr>
         <w:t xml:space="preserve">    2.3. Tools to Support Project Management</w:t>
       </w:r>
     </w:p>
@@ -4205,332 +4676,1087 @@
         <w:rPr>
           <w:lang w:val="en-GB"/>
         </w:rPr>
+        <w:t xml:space="preserve">        3.1.3. Problem Generalisation for the Master Thesis [NEW]</w:t>
+      </w:r>
+    </w:p>
+    <w:p>
+      <w:pPr>
+        <w:rPr>
+          <w:lang w:val="en-GB"/>
+        </w:rPr>
+      </w:pPr>
+    </w:p>
+    <w:p>
+      <w:pPr>
+        <w:rPr>
+          <w:lang w:val="en-GB"/>
+        </w:rPr>
+      </w:pPr>
+      <w:r>
+        <w:rPr>
+          <w:lang w:val="en-GB"/>
+        </w:rPr>
+        <w:t xml:space="preserve">    3.2. Research Gap [CHANGED]</w:t>
+      </w:r>
+    </w:p>
+    <w:p>
+      <w:pPr>
+        <w:rPr>
+          <w:lang w:val="en-GB"/>
+        </w:rPr>
+      </w:pPr>
+    </w:p>
+    <w:p>
+      <w:pPr>
+        <w:rPr>
+          <w:lang w:val="en-GB"/>
+        </w:rPr>
+      </w:pPr>
+      <w:r>
+        <w:rPr>
+          <w:lang w:val="en-GB"/>
+        </w:rPr>
+        <w:t xml:space="preserve">    3.3. Research Objective [NEW]</w:t>
+      </w:r>
+    </w:p>
+    <w:p>
+      <w:pPr>
+        <w:rPr>
+          <w:lang w:val="en-GB"/>
+        </w:rPr>
+      </w:pPr>
+    </w:p>
+    <w:p>
+      <w:pPr>
+        <w:rPr>
+          <w:lang w:val="en-GB"/>
+        </w:rPr>
+      </w:pPr>
+      <w:r>
+        <w:rPr>
+          <w:lang w:val="en-GB"/>
+        </w:rPr>
+        <w:t xml:space="preserve">    3.4. Research Question [CHANGED]</w:t>
+      </w:r>
+    </w:p>
+    <w:p>
+      <w:pPr>
+        <w:rPr>
+          <w:lang w:val="en-GB"/>
+        </w:rPr>
+      </w:pPr>
+    </w:p>
+    <w:p>
+      <w:pPr>
+        <w:rPr>
+          <w:lang w:val="en-GB"/>
+        </w:rPr>
+      </w:pPr>
+      <w:r>
+        <w:rPr>
+          <w:lang w:val="en-GB"/>
+        </w:rPr>
+        <w:t xml:space="preserve">    3.5. Research Hypotheses [NEW]</w:t>
+      </w:r>
+    </w:p>
+    <w:p>
+      <w:pPr>
+        <w:rPr>
+          <w:lang w:val="en-GB"/>
+        </w:rPr>
+      </w:pPr>
+    </w:p>
+    <w:p>
+      <w:pPr>
+        <w:rPr>
+          <w:lang w:val="en-GB"/>
+        </w:rPr>
+      </w:pPr>
+      <w:r>
+        <w:rPr>
+          <w:lang w:val="en-GB"/>
+        </w:rPr>
+        <w:t xml:space="preserve">    3.6. Research Methodology [NEW]</w:t>
+      </w:r>
+    </w:p>
+    <w:p>
+      <w:pPr>
+        <w:rPr>
+          <w:lang w:val="en-GB"/>
+        </w:rPr>
+      </w:pPr>
+      <w:r>
+        <w:rPr>
+          <w:lang w:val="en-GB"/>
+        </w:rPr>
+        <w:t xml:space="preserve">        3.6.1. Research Approach</w:t>
+      </w:r>
+    </w:p>
+    <w:p>
+      <w:pPr>
+        <w:rPr>
+          <w:lang w:val="en-GB"/>
+        </w:rPr>
+      </w:pPr>
+      <w:r>
+        <w:rPr>
+          <w:lang w:val="en-GB"/>
+        </w:rPr>
+        <w:t xml:space="preserve">        3.6.2. Comparison of Detection Approaches</w:t>
+      </w:r>
+    </w:p>
+    <w:p>
+      <w:pPr>
+        <w:rPr>
+          <w:lang w:val="en-GB"/>
+        </w:rPr>
+      </w:pPr>
+      <w:r>
+        <w:rPr>
+          <w:lang w:val="en-GB"/>
+        </w:rPr>
+        <w:t xml:space="preserve">        3.6.3. Experimental Design</w:t>
+      </w:r>
+    </w:p>
+    <w:p>
+      <w:pPr>
+        <w:rPr>
+          <w:lang w:val="en-GB"/>
+        </w:rPr>
+      </w:pPr>
+      <w:r>
+        <w:rPr>
+          <w:lang w:val="en-GB"/>
+        </w:rPr>
+        <w:t xml:space="preserve">        3.6.4. Evaluation Criteria and Metrics</w:t>
+      </w:r>
+    </w:p>
+    <w:p>
+      <w:pPr>
+        <w:rPr>
+          <w:lang w:val="en-GB"/>
+        </w:rPr>
+      </w:pPr>
+    </w:p>
+    <w:p>
+      <w:pPr>
+        <w:rPr>
+          <w:lang w:val="en-GB"/>
+        </w:rPr>
+      </w:pPr>
+      <w:r>
+        <w:rPr>
+          <w:lang w:val="en-GB"/>
+        </w:rPr>
+        <w:t xml:space="preserve">    3.7. Success Definition [CHANGED]</w:t>
+      </w:r>
+    </w:p>
+    <w:p>
+      <w:pPr>
+        <w:rPr>
+          <w:lang w:val="en-GB"/>
+        </w:rPr>
+      </w:pPr>
+    </w:p>
+    <w:p>
+      <w:pPr>
+        <w:rPr>
+          <w:lang w:val="en-GB"/>
+        </w:rPr>
+      </w:pPr>
+      <w:r>
+        <w:rPr>
+          <w:lang w:val="en-GB"/>
+        </w:rPr>
+        <w:t xml:space="preserve">    3.8. S.M.A.R.T. Goals [CHANGED]</w:t>
+      </w:r>
+    </w:p>
+    <w:p>
+      <w:pPr>
+        <w:rPr>
+          <w:lang w:val="en-GB"/>
+        </w:rPr>
+      </w:pPr>
+    </w:p>
+    <w:p>
+      <w:pPr>
+        <w:rPr>
+          <w:lang w:val="en-GB"/>
+        </w:rPr>
+      </w:pPr>
+      <w:r>
+        <w:rPr>
+          <w:lang w:val="en-GB"/>
+        </w:rPr>
+        <w:t xml:space="preserve">    3.9. Expected Contributions [NEW]</w:t>
+      </w:r>
+    </w:p>
+    <w:p>
+      <w:pPr>
+        <w:rPr>
+          <w:lang w:val="en-GB"/>
+        </w:rPr>
+      </w:pPr>
+      <w:r>
+        <w:rPr>
+          <w:lang w:val="en-GB"/>
+        </w:rPr>
+        <w:t xml:space="preserve">        3.9.1. Practical Contribution</w:t>
+      </w:r>
+    </w:p>
+    <w:p>
+      <w:pPr>
+        <w:rPr>
+          <w:lang w:val="en-GB"/>
+        </w:rPr>
+      </w:pPr>
+      <w:r>
+        <w:rPr>
+          <w:lang w:val="en-GB"/>
+        </w:rPr>
+        <w:t xml:space="preserve">        3.9.2. Scientific Contribution</w:t>
+      </w:r>
+    </w:p>
+    <w:p>
+      <w:pPr>
+        <w:rPr>
+          <w:lang w:val="en-GB"/>
+        </w:rPr>
+      </w:pPr>
+    </w:p>
+    <w:p>
+      <w:pPr>
+        <w:rPr>
+          <w:lang w:val="en-GB"/>
+        </w:rPr>
+      </w:pPr>
+      <w:r>
+        <w:rPr>
+          <w:lang w:val="en-GB"/>
+        </w:rPr>
+        <w:t xml:space="preserve">    3.10. Expected Benefits for the Reporting Solution [CHANGED]</w:t>
+      </w:r>
+    </w:p>
+    <w:p>
+      <w:pPr>
+        <w:rPr>
+          <w:lang w:val="en-GB"/>
+        </w:rPr>
+      </w:pPr>
+    </w:p>
+    <w:p>
+      <w:pPr>
+        <w:rPr>
+          <w:lang w:val="en-GB"/>
+        </w:rPr>
+      </w:pPr>
+    </w:p>
+    <w:p>
+      <w:pPr>
+        <w:rPr>
+          <w:lang w:val="en-GB"/>
+        </w:rPr>
+      </w:pPr>
+      <w:r>
+        <w:rPr>
+          <w:lang w:val="en-GB"/>
+        </w:rPr>
+        <w:t>4. Solution Landscape</w:t>
+      </w:r>
+    </w:p>
+    <w:p>
+      <w:pPr>
+        <w:rPr>
+          <w:lang w:val="en-GB"/>
+        </w:rPr>
+      </w:pPr>
+      <w:r>
+        <w:rPr>
+          <w:lang w:val="en-GB"/>
+        </w:rPr>
+        <w:t xml:space="preserve">    4.1. Data Quality Management at Swiss Post</w:t>
+      </w:r>
+    </w:p>
+    <w:p>
+      <w:pPr>
+        <w:rPr>
+          <w:lang w:val="en-GB"/>
+        </w:rPr>
+      </w:pPr>
+      <w:r>
+        <w:rPr>
+          <w:lang w:val="en-GB"/>
+        </w:rPr>
+        <w:t xml:space="preserve">    4.2. Existing Rule-Based DQM Initiative</w:t>
+      </w:r>
+    </w:p>
+    <w:p>
+      <w:pPr>
+        <w:rPr>
+          <w:lang w:val="en-GB"/>
+        </w:rPr>
+      </w:pPr>
+      <w:r>
+        <w:rPr>
+          <w:lang w:val="en-GB"/>
+        </w:rPr>
+        <w:t xml:space="preserve">    4.3. Heterogeneous Sorting Centre Environments</w:t>
+      </w:r>
+    </w:p>
+    <w:p>
+      <w:pPr>
+        <w:rPr>
+          <w:lang w:val="en-GB"/>
+        </w:rPr>
+      </w:pPr>
+      <w:r>
+        <w:rPr>
+          <w:lang w:val="en-GB"/>
+        </w:rPr>
+        <w:t xml:space="preserve">    4.4. Data Lineage</w:t>
+      </w:r>
+    </w:p>
+    <w:p>
+      <w:pPr>
+        <w:rPr>
+          <w:lang w:val="en-GB"/>
+        </w:rPr>
+      </w:pPr>
+      <w:r>
+        <w:rPr>
+          <w:lang w:val="en-GB"/>
+        </w:rPr>
+        <w:t xml:space="preserve">    4.5. Existing Reporting Pipeline</w:t>
+      </w:r>
+    </w:p>
+    <w:p>
+      <w:pPr>
+        <w:rPr>
+          <w:lang w:val="en-GB"/>
+        </w:rPr>
+      </w:pPr>
+      <w:r>
+        <w:rPr>
+          <w:lang w:val="en-GB"/>
+        </w:rPr>
+        <w:t xml:space="preserve">    4.6. Existing Data Quality Reporting and Visualisation</w:t>
+      </w:r>
+    </w:p>
+    <w:p>
+      <w:pPr>
+        <w:rPr>
+          <w:lang w:val="en-GB"/>
+        </w:rPr>
+      </w:pPr>
+      <w:r>
+        <w:rPr>
+          <w:lang w:val="en-GB"/>
+        </w:rPr>
+        <w:t xml:space="preserve">    4.7. Existing DQM Platform and Infrastructure [CHANGED]</w:t>
+      </w:r>
+    </w:p>
+    <w:p>
+      <w:pPr>
+        <w:rPr>
+          <w:lang w:val="en-GB"/>
+        </w:rPr>
+      </w:pPr>
+      <w:r>
+        <w:rPr>
+          <w:lang w:val="en-GB"/>
+        </w:rPr>
+        <w:t xml:space="preserve">    4.8. Baseline for the Master Thesis [NEW]</w:t>
+      </w:r>
+    </w:p>
+    <w:p>
+      <w:pPr>
+        <w:rPr>
+          <w:lang w:val="en-GB"/>
+        </w:rPr>
+      </w:pPr>
+    </w:p>
+    <w:p>
+      <w:pPr>
+        <w:rPr>
+          <w:lang w:val="en-GB"/>
+        </w:rPr>
+      </w:pPr>
+    </w:p>
+    <w:p>
+      <w:pPr>
+        <w:rPr>
+          <w:lang w:val="en-GB"/>
+        </w:rPr>
+      </w:pPr>
+      <w:r>
+        <w:rPr>
+          <w:lang w:val="en-GB"/>
+        </w:rPr>
+        <w:t>5. Implementation</w:t>
+      </w:r>
+    </w:p>
+    <w:p>
+      <w:pPr>
+        <w:rPr>
+          <w:lang w:val="en-GB"/>
+        </w:rPr>
+      </w:pPr>
+      <w:r>
+        <w:rPr>
+          <w:lang w:val="en-GB"/>
+        </w:rPr>
+        <w:t xml:space="preserve">    5.1. Technical and Experimental Setup [CHANGED]</w:t>
+      </w:r>
+    </w:p>
+    <w:p>
+      <w:pPr>
+        <w:rPr>
+          <w:lang w:val="en-GB"/>
+        </w:rPr>
+      </w:pPr>
+    </w:p>
+    <w:p>
+      <w:pPr>
+        <w:rPr>
+          <w:lang w:val="en-GB"/>
+        </w:rPr>
+      </w:pPr>
+      <w:r>
+        <w:rPr>
+          <w:lang w:val="en-GB"/>
+        </w:rPr>
+        <w:t xml:space="preserve">    5.2. </w:t>
+      </w:r>
+      <w:r>
+        <w:rPr>
+          <w:lang w:val="en-GB"/>
+        </w:rPr>
+        <w:t xml:space="preserve">First </w:t>
+      </w:r>
+      <w:r>
+        <w:rPr>
+          <w:lang w:val="en-GB"/>
+        </w:rPr>
+        <w:t xml:space="preserve">Basic </w:t>
+      </w:r>
+      <w:r>
+        <w:rPr>
+          <w:lang w:val="en-GB"/>
+        </w:rPr>
+        <w:t>Detection</w:t>
+      </w:r>
+      <w:r>
+        <w:rPr>
+          <w:lang w:val="en-GB"/>
+        </w:rPr>
+        <w:t xml:space="preserve"> Approach </w:t>
+      </w:r>
+      <w:r>
+        <w:rPr>
+          <w:lang w:val="en-GB"/>
+        </w:rPr>
+        <w:t xml:space="preserve">(Eventually Rule </w:t>
+      </w:r>
+      <w:r>
+        <w:rPr>
+          <w:lang w:val="en-GB"/>
+        </w:rPr>
+        <w:t>based)</w:t>
+      </w:r>
+      <w:r>
+        <w:rPr>
+          <w:lang w:val="en-GB"/>
+        </w:rPr>
+        <w:t xml:space="preserve"> [</w:t>
+      </w:r>
+      <w:r>
+        <w:rPr>
+          <w:lang w:val="en-GB"/>
+        </w:rPr>
+        <w:t>CHANGED]</w:t>
+      </w:r>
+    </w:p>
+    <w:p>
+      <w:pPr>
+        <w:rPr>
+          <w:lang w:val="en-GB"/>
+        </w:rPr>
+      </w:pPr>
+      <w:r>
+        <w:rPr>
+          <w:lang w:val="en-GB"/>
+        </w:rPr>
+        <w:t xml:space="preserve">        5.2.1. Design</w:t>
+      </w:r>
+    </w:p>
+    <w:p>
+      <w:pPr>
+        <w:rPr>
+          <w:lang w:val="en-GB"/>
+        </w:rPr>
+      </w:pPr>
+      <w:r>
+        <w:rPr>
+          <w:lang w:val="en-GB"/>
+        </w:rPr>
+        <w:t xml:space="preserve">        5.2.2. Implementation</w:t>
+      </w:r>
+    </w:p>
+    <w:p>
+      <w:pPr>
+        <w:rPr>
+          <w:lang w:val="en-GB"/>
+        </w:rPr>
+      </w:pPr>
+      <w:r>
+        <w:rPr>
+          <w:lang w:val="en-GB"/>
+        </w:rPr>
+        <w:t xml:space="preserve">        5.2.3. Technical Validation</w:t>
+      </w:r>
+    </w:p>
+    <w:p>
+      <w:pPr>
+        <w:rPr>
+          <w:lang w:val="en-GB"/>
+        </w:rPr>
+      </w:pPr>
+    </w:p>
+    <w:p>
+      <w:pPr>
+        <w:rPr>
+          <w:lang w:val="en-GB"/>
+        </w:rPr>
+      </w:pPr>
+      <w:r>
+        <w:rPr>
+          <w:lang w:val="en-GB"/>
+        </w:rPr>
+        <w:t xml:space="preserve">    5.3. </w:t>
+      </w:r>
+      <w:r>
+        <w:rPr>
+          <w:lang w:val="en-GB"/>
+        </w:rPr>
+        <w:t xml:space="preserve">Improved Detection </w:t>
+      </w:r>
+      <w:r>
+        <w:rPr>
+          <w:lang w:val="en-GB"/>
+        </w:rPr>
+        <w:t>methods</w:t>
+      </w:r>
+      <w:r>
+        <w:rPr>
+          <w:lang w:val="en-GB"/>
+        </w:rPr>
+        <w:t>,</w:t>
+      </w:r>
+      <w:r>
+        <w:rPr>
+          <w:lang w:val="en-GB"/>
+        </w:rPr>
+        <w:t xml:space="preserve"> </w:t>
+      </w:r>
+      <w:r>
+        <w:rPr>
+          <w:lang w:val="en-GB"/>
+        </w:rPr>
+        <w:t>(Statistical?</w:t>
+      </w:r>
+      <w:r>
+        <w:rPr>
+          <w:lang w:val="en-GB"/>
+        </w:rPr>
+        <w:t xml:space="preserve"> Different </w:t>
+      </w:r>
+      <w:r>
+        <w:rPr>
+          <w:lang w:val="en-GB"/>
+        </w:rPr>
+        <w:t>tools?</w:t>
+      </w:r>
+      <w:r>
+        <w:rPr>
+          <w:lang w:val="en-GB"/>
+        </w:rPr>
+        <w:t xml:space="preserve"> My very own </w:t>
+      </w:r>
+      <w:r>
+        <w:rPr>
+          <w:lang w:val="en-GB"/>
+        </w:rPr>
+        <w:t>implementation)</w:t>
+      </w:r>
+      <w:r>
+        <w:rPr>
+          <w:lang w:val="en-GB"/>
+        </w:rPr>
+        <w:t xml:space="preserve"> [</w:t>
+      </w:r>
+      <w:r>
+        <w:rPr>
+          <w:lang w:val="en-GB"/>
+        </w:rPr>
+        <w:t>NEW]</w:t>
+      </w:r>
+    </w:p>
+    <w:p>
+      <w:pPr>
+        <w:rPr>
+          <w:lang w:val="en-GB"/>
+        </w:rPr>
+      </w:pPr>
+      <w:r>
+        <w:rPr>
+          <w:lang w:val="en-GB"/>
+        </w:rPr>
+        <w:t xml:space="preserve">        5.3.1. Design</w:t>
+      </w:r>
+    </w:p>
+    <w:p>
+      <w:pPr>
+        <w:rPr>
+          <w:lang w:val="en-GB"/>
+        </w:rPr>
+      </w:pPr>
+      <w:r>
+        <w:rPr>
+          <w:lang w:val="en-GB"/>
+        </w:rPr>
+        <w:t xml:space="preserve">        5.3.2. Implementation</w:t>
+      </w:r>
+    </w:p>
+    <w:p>
+      <w:pPr>
+        <w:rPr>
+          <w:lang w:val="en-GB"/>
+        </w:rPr>
+      </w:pPr>
+      <w:r>
+        <w:rPr>
+          <w:lang w:val="en-GB"/>
+        </w:rPr>
+        <w:t xml:space="preserve">        5.3.3. Technical Validation</w:t>
+      </w:r>
+    </w:p>
+    <w:p>
+      <w:pPr>
+        <w:rPr>
+          <w:lang w:val="en-GB"/>
+        </w:rPr>
+      </w:pPr>
+    </w:p>
+    <w:p>
+      <w:pPr>
+        <w:rPr>
+          <w:lang w:val="en-GB"/>
+        </w:rPr>
+      </w:pPr>
+      <w:r>
+        <w:rPr>
+          <w:lang w:val="en-GB"/>
+        </w:rPr>
+        <w:t xml:space="preserve">    5.4. Advanced </w:t>
+      </w:r>
+      <w:r>
+        <w:rPr>
+          <w:lang w:val="en-GB"/>
+        </w:rPr>
+        <w:t xml:space="preserve">Detection </w:t>
+      </w:r>
+      <w:r>
+        <w:rPr>
+          <w:lang w:val="en-GB"/>
+        </w:rPr>
+        <w:t>Approach</w:t>
+      </w:r>
+      <w:r>
+        <w:rPr>
+          <w:lang w:val="en-GB"/>
+        </w:rPr>
+        <w:t>, (ML/Own / Extended first second approach / New Ideas… alternative implementation when 1 2 failed)</w:t>
+      </w:r>
+      <w:r>
+        <w:rPr>
+          <w:lang w:val="en-GB"/>
+        </w:rPr>
+        <w:t xml:space="preserve"> [NEW]</w:t>
+      </w:r>
+    </w:p>
+    <w:p>
+      <w:pPr>
+        <w:rPr>
+          <w:lang w:val="en-GB"/>
+        </w:rPr>
+      </w:pPr>
+      <w:r>
+        <w:rPr>
+          <w:lang w:val="en-GB"/>
+        </w:rPr>
+        <w:t xml:space="preserve">        5.4.1. Selection of Approach</w:t>
+      </w:r>
+    </w:p>
+    <w:p>
+      <w:pPr>
+        <w:rPr>
+          <w:lang w:val="en-GB"/>
+        </w:rPr>
+      </w:pPr>
+      <w:r>
+        <w:rPr>
+          <w:lang w:val="en-GB"/>
+        </w:rPr>
         <w:lastRenderedPageBreak/>
-        <w:t xml:space="preserve">        3.1.3. Problem Generalisation for the Master Thesis [NEW]</w:t>
-      </w:r>
-    </w:p>
-    <w:p>
-      <w:pPr>
-        <w:rPr>
-          <w:lang w:val="en-GB"/>
-        </w:rPr>
-      </w:pPr>
-    </w:p>
-    <w:p>
-      <w:pPr>
-        <w:rPr>
-          <w:lang w:val="en-GB"/>
-        </w:rPr>
-      </w:pPr>
-      <w:r>
-        <w:rPr>
-          <w:lang w:val="en-GB"/>
-        </w:rPr>
-        <w:t xml:space="preserve">    3.2. Research Gap [CHANGED]</w:t>
-      </w:r>
-    </w:p>
-    <w:p>
-      <w:pPr>
-        <w:rPr>
-          <w:lang w:val="en-GB"/>
-        </w:rPr>
-      </w:pPr>
-    </w:p>
-    <w:p>
-      <w:pPr>
-        <w:rPr>
-          <w:lang w:val="en-GB"/>
-        </w:rPr>
-      </w:pPr>
-      <w:r>
-        <w:rPr>
-          <w:lang w:val="en-GB"/>
-        </w:rPr>
-        <w:t xml:space="preserve">    3.3. Research Objective [NEW]</w:t>
-      </w:r>
-    </w:p>
-    <w:p>
-      <w:pPr>
-        <w:rPr>
-          <w:lang w:val="en-GB"/>
-        </w:rPr>
-      </w:pPr>
-    </w:p>
-    <w:p>
-      <w:pPr>
-        <w:rPr>
-          <w:lang w:val="en-GB"/>
-        </w:rPr>
-      </w:pPr>
-      <w:r>
-        <w:rPr>
-          <w:lang w:val="en-GB"/>
-        </w:rPr>
-        <w:t xml:space="preserve">    3.4. Research Question [CHANGED]</w:t>
-      </w:r>
-    </w:p>
-    <w:p>
-      <w:pPr>
-        <w:rPr>
-          <w:lang w:val="en-GB"/>
-        </w:rPr>
-      </w:pPr>
-    </w:p>
-    <w:p>
-      <w:pPr>
-        <w:rPr>
-          <w:lang w:val="en-GB"/>
-        </w:rPr>
-      </w:pPr>
-      <w:r>
-        <w:rPr>
-          <w:lang w:val="en-GB"/>
-        </w:rPr>
-        <w:t xml:space="preserve">    3.5. Research Hypotheses [NEW]</w:t>
-      </w:r>
-    </w:p>
-    <w:p>
-      <w:pPr>
-        <w:rPr>
-          <w:lang w:val="en-GB"/>
-        </w:rPr>
-      </w:pPr>
-    </w:p>
-    <w:p>
-      <w:pPr>
-        <w:rPr>
-          <w:lang w:val="en-GB"/>
-        </w:rPr>
-      </w:pPr>
-      <w:r>
-        <w:rPr>
-          <w:lang w:val="en-GB"/>
-        </w:rPr>
-        <w:t xml:space="preserve">    3.6. Research Methodology [NEW]</w:t>
-      </w:r>
-    </w:p>
-    <w:p>
-      <w:pPr>
-        <w:rPr>
-          <w:lang w:val="en-GB"/>
-        </w:rPr>
-      </w:pPr>
-      <w:r>
-        <w:rPr>
-          <w:lang w:val="en-GB"/>
-        </w:rPr>
-        <w:t xml:space="preserve">        3.6.1. Research Approach</w:t>
-      </w:r>
-    </w:p>
-    <w:p>
-      <w:pPr>
-        <w:rPr>
-          <w:lang w:val="en-GB"/>
-        </w:rPr>
-      </w:pPr>
-      <w:r>
-        <w:rPr>
-          <w:lang w:val="en-GB"/>
-        </w:rPr>
-        <w:t xml:space="preserve">        3.6.2. Comparison of Detection Approaches</w:t>
-      </w:r>
-    </w:p>
-    <w:p>
-      <w:pPr>
-        <w:rPr>
-          <w:lang w:val="en-GB"/>
-        </w:rPr>
-      </w:pPr>
-      <w:r>
-        <w:rPr>
-          <w:lang w:val="en-GB"/>
-        </w:rPr>
-        <w:t xml:space="preserve">        3.6.3. Experimental Design</w:t>
-      </w:r>
-    </w:p>
-    <w:p>
-      <w:pPr>
-        <w:rPr>
-          <w:lang w:val="en-GB"/>
-        </w:rPr>
-      </w:pPr>
-      <w:r>
-        <w:rPr>
-          <w:lang w:val="en-GB"/>
-        </w:rPr>
-        <w:t xml:space="preserve">        3.6.4. Evaluation Criteria and Metrics</w:t>
-      </w:r>
-    </w:p>
-    <w:p>
-      <w:pPr>
-        <w:rPr>
-          <w:lang w:val="en-GB"/>
-        </w:rPr>
-      </w:pPr>
-    </w:p>
-    <w:p>
-      <w:pPr>
-        <w:rPr>
-          <w:lang w:val="en-GB"/>
-        </w:rPr>
-      </w:pPr>
-      <w:r>
-        <w:rPr>
-          <w:lang w:val="en-GB"/>
-        </w:rPr>
-        <w:t xml:space="preserve">    3.7. Success Definition [CHANGED]</w:t>
-      </w:r>
-    </w:p>
-    <w:p>
-      <w:pPr>
-        <w:rPr>
-          <w:lang w:val="en-GB"/>
-        </w:rPr>
-      </w:pPr>
-    </w:p>
-    <w:p>
-      <w:pPr>
-        <w:rPr>
-          <w:lang w:val="en-GB"/>
-        </w:rPr>
-      </w:pPr>
-      <w:r>
-        <w:rPr>
-          <w:lang w:val="en-GB"/>
-        </w:rPr>
-        <w:t xml:space="preserve">    3.8. S.M.A.R.T. Goals [CHANGED]</w:t>
-      </w:r>
-    </w:p>
-    <w:p>
-      <w:pPr>
-        <w:rPr>
-          <w:lang w:val="en-GB"/>
-        </w:rPr>
-      </w:pPr>
-    </w:p>
-    <w:p>
-      <w:pPr>
-        <w:rPr>
-          <w:lang w:val="en-GB"/>
-        </w:rPr>
-      </w:pPr>
-      <w:r>
-        <w:rPr>
-          <w:lang w:val="en-GB"/>
-        </w:rPr>
-        <w:t xml:space="preserve">    3.9. Expected Contributions [NEW]</w:t>
-      </w:r>
-    </w:p>
-    <w:p>
-      <w:pPr>
-        <w:rPr>
-          <w:lang w:val="en-GB"/>
-        </w:rPr>
-      </w:pPr>
-      <w:r>
-        <w:rPr>
-          <w:lang w:val="en-GB"/>
-        </w:rPr>
-        <w:t xml:space="preserve">        3.9.1. Practical Contribution</w:t>
-      </w:r>
-    </w:p>
-    <w:p>
-      <w:pPr>
-        <w:rPr>
-          <w:lang w:val="en-GB"/>
-        </w:rPr>
-      </w:pPr>
-      <w:r>
-        <w:rPr>
-          <w:lang w:val="en-GB"/>
-        </w:rPr>
-        <w:t xml:space="preserve">        3.9.2. Scientific Contribution</w:t>
-      </w:r>
-    </w:p>
-    <w:p>
-      <w:pPr>
-        <w:rPr>
-          <w:lang w:val="en-GB"/>
-        </w:rPr>
-      </w:pPr>
-    </w:p>
-    <w:p>
-      <w:pPr>
-        <w:rPr>
-          <w:lang w:val="en-GB"/>
-        </w:rPr>
-      </w:pPr>
-      <w:r>
-        <w:rPr>
-          <w:lang w:val="en-GB"/>
-        </w:rPr>
-        <w:t xml:space="preserve">    3.10. Expected Benefits for the Reporting Solution [CHANGED]</w:t>
-      </w:r>
-    </w:p>
-    <w:p>
-      <w:pPr>
-        <w:rPr>
-          <w:lang w:val="en-GB"/>
-        </w:rPr>
-      </w:pPr>
-    </w:p>
-    <w:p>
-      <w:pPr>
-        <w:rPr>
-          <w:lang w:val="en-GB"/>
-        </w:rPr>
-      </w:pPr>
-    </w:p>
-    <w:p>
-      <w:pPr>
-        <w:rPr>
-          <w:lang w:val="en-GB"/>
-        </w:rPr>
-      </w:pPr>
-      <w:r>
-        <w:rPr>
-          <w:lang w:val="en-GB"/>
-        </w:rPr>
-        <w:t>4. Solution Landscape</w:t>
-      </w:r>
-    </w:p>
-    <w:p>
-      <w:pPr>
-        <w:rPr>
-          <w:lang w:val="en-GB"/>
-        </w:rPr>
-      </w:pPr>
-      <w:r>
-        <w:rPr>
-          <w:lang w:val="en-GB"/>
-        </w:rPr>
-        <w:t xml:space="preserve">    4.1. Data Quality Management at Swiss Post</w:t>
-      </w:r>
-    </w:p>
-    <w:p>
-      <w:pPr>
-        <w:rPr>
-          <w:lang w:val="en-GB"/>
-        </w:rPr>
-      </w:pPr>
-      <w:r>
-        <w:rPr>
-          <w:lang w:val="en-GB"/>
-        </w:rPr>
-        <w:t xml:space="preserve">    4.2. Existing Rule-Based DQM Initiative</w:t>
-      </w:r>
-    </w:p>
-    <w:p>
-      <w:pPr>
-        <w:rPr>
-          <w:lang w:val="en-GB"/>
-        </w:rPr>
-      </w:pPr>
-      <w:r>
-        <w:rPr>
-          <w:lang w:val="en-GB"/>
-        </w:rPr>
-        <w:t xml:space="preserve">    4.3. Heterogeneous Sorting Centre Environments</w:t>
+        <w:t xml:space="preserve">        5.4.2. Design</w:t>
+      </w:r>
+    </w:p>
+    <w:p>
+      <w:pPr>
+        <w:rPr>
+          <w:lang w:val="en-GB"/>
+        </w:rPr>
+      </w:pPr>
+      <w:r>
+        <w:rPr>
+          <w:lang w:val="en-GB"/>
+        </w:rPr>
+        <w:t xml:space="preserve">        5.4.3. Implementation</w:t>
+      </w:r>
+    </w:p>
+    <w:p>
+      <w:pPr>
+        <w:rPr>
+          <w:lang w:val="en-GB"/>
+        </w:rPr>
+      </w:pPr>
+      <w:r>
+        <w:rPr>
+          <w:lang w:val="en-GB"/>
+        </w:rPr>
+        <w:t xml:space="preserve">        5.4.4. Technical Validation</w:t>
+      </w:r>
+    </w:p>
+    <w:p>
+      <w:pPr>
+        <w:rPr>
+          <w:lang w:val="en-GB"/>
+        </w:rPr>
+      </w:pPr>
+    </w:p>
+    <w:p>
+      <w:pPr>
+        <w:rPr>
+          <w:lang w:val="en-GB"/>
+        </w:rPr>
+      </w:pPr>
+    </w:p>
+    <w:p>
+      <w:pPr>
+        <w:rPr>
+          <w:lang w:val="en-GB"/>
+        </w:rPr>
+      </w:pPr>
+    </w:p>
+    <w:p>
+      <w:pPr>
+        <w:rPr>
+          <w:lang w:val="en-GB"/>
+        </w:rPr>
+      </w:pPr>
+      <w:r>
+        <w:rPr>
+          <w:lang w:val="en-GB"/>
+        </w:rPr>
+        <w:t>6. Results</w:t>
+      </w:r>
+    </w:p>
+    <w:p>
+      <w:pPr>
+        <w:rPr>
+          <w:lang w:val="en-GB"/>
+        </w:rPr>
+      </w:pPr>
+      <w:r>
+        <w:rPr>
+          <w:lang w:val="en-GB"/>
+        </w:rPr>
+        <w:t xml:space="preserve">    6.1. Introduction</w:t>
+      </w:r>
+    </w:p>
+    <w:p>
+      <w:pPr>
+        <w:rPr>
+          <w:lang w:val="en-GB"/>
+        </w:rPr>
+      </w:pPr>
+      <w:r>
+        <w:rPr>
+          <w:lang w:val="en-GB"/>
+        </w:rPr>
+        <w:t xml:space="preserve">    6.2. Evaluation Criteria and Experimental Conditions [CHANGED]</w:t>
+      </w:r>
+    </w:p>
+    <w:p>
+      <w:pPr>
+        <w:rPr>
+          <w:lang w:val="en-GB"/>
+        </w:rPr>
+      </w:pPr>
+      <w:r>
+        <w:rPr>
+          <w:lang w:val="en-GB"/>
+        </w:rPr>
+        <w:t xml:space="preserve">    6.3. Rule-Based Approach Results [CHANGED]</w:t>
+      </w:r>
+    </w:p>
+    <w:p>
+      <w:pPr>
+        <w:rPr>
+          <w:lang w:val="en-GB"/>
+        </w:rPr>
+      </w:pPr>
+      <w:r>
+        <w:rPr>
+          <w:lang w:val="en-GB"/>
+        </w:rPr>
+        <w:t xml:space="preserve">    6.4. Statistical Approach Results [NEW]</w:t>
+      </w:r>
+    </w:p>
+    <w:p>
+      <w:pPr>
+        <w:rPr>
+          <w:lang w:val="en-GB"/>
+        </w:rPr>
+      </w:pPr>
+      <w:r>
+        <w:rPr>
+          <w:lang w:val="en-GB"/>
+        </w:rPr>
+        <w:t xml:space="preserve">    6.5. Advanced / Machine-Learning Approach Results [NEW]</w:t>
+      </w:r>
+    </w:p>
+    <w:p>
+      <w:pPr>
+        <w:rPr>
+          <w:lang w:val="en-GB"/>
+        </w:rPr>
+      </w:pPr>
+      <w:r>
+        <w:rPr>
+          <w:lang w:val="en-GB"/>
+        </w:rPr>
+        <w:t xml:space="preserve">    6.6. Comparative Evaluation [NEW]</w:t>
+      </w:r>
+    </w:p>
+    <w:p>
+      <w:pPr>
+        <w:rPr>
+          <w:lang w:val="en-GB"/>
+        </w:rPr>
+      </w:pPr>
+      <w:r>
+        <w:rPr>
+          <w:lang w:val="en-GB"/>
+        </w:rPr>
+        <w:t xml:space="preserve">    6.7. Practical / Stakeholder Evaluation [NEW]</w:t>
+      </w:r>
+    </w:p>
+    <w:p>
+      <w:pPr>
+        <w:rPr>
+          <w:lang w:val="en-GB"/>
+        </w:rPr>
+      </w:pPr>
+      <w:r>
+        <w:rPr>
+          <w:lang w:val="en-GB"/>
+        </w:rPr>
+        <w:t xml:space="preserve">    6.8. Summary</w:t>
+      </w:r>
+    </w:p>
+    <w:p>
+      <w:pPr>
+        <w:rPr>
+          <w:lang w:val="en-GB"/>
+        </w:rPr>
+      </w:pPr>
+    </w:p>
+    <w:p>
+      <w:pPr>
+        <w:rPr>
+          <w:lang w:val="en-GB"/>
+        </w:rPr>
+      </w:pPr>
+    </w:p>
+    <w:p>
+      <w:pPr>
+        <w:rPr>
+          <w:lang w:val="en-GB"/>
+        </w:rPr>
+      </w:pPr>
+      <w:r>
+        <w:rPr>
+          <w:lang w:val="en-GB"/>
+        </w:rPr>
+        <w:t>7. Discussion [CHANGED]</w:t>
+      </w:r>
+    </w:p>
+    <w:p>
+      <w:pPr>
+        <w:rPr>
+          <w:lang w:val="en-GB"/>
+        </w:rPr>
+      </w:pPr>
+      <w:r>
+        <w:rPr>
+          <w:lang w:val="en-GB"/>
+        </w:rPr>
+        <w:t xml:space="preserve">    7.1. Interpretation of Results [NEW]</w:t>
+      </w:r>
+    </w:p>
+    <w:p>
+      <w:pPr>
+        <w:rPr>
+          <w:lang w:val="en-GB"/>
+        </w:rPr>
+      </w:pPr>
+      <w:r>
+        <w:rPr>
+          <w:lang w:val="en-GB"/>
+        </w:rPr>
+        <w:t xml:space="preserve">    7.2. Evaluation of Research Hypotheses [NEW]</w:t>
+      </w:r>
+    </w:p>
+    <w:p>
+      <w:pPr>
+        <w:rPr>
+          <w:lang w:val="en-GB"/>
+        </w:rPr>
+      </w:pPr>
+      <w:r>
+        <w:rPr>
+          <w:lang w:val="en-GB"/>
+        </w:rPr>
+        <w:t xml:space="preserve">    7.3. Answer to the Research Question [NEW]</w:t>
+      </w:r>
+    </w:p>
+    <w:p>
+      <w:pPr>
+        <w:rPr>
+          <w:lang w:val="en-GB"/>
+        </w:rPr>
+      </w:pPr>
+      <w:r>
+        <w:rPr>
+          <w:lang w:val="en-GB"/>
+        </w:rPr>
+        <w:t xml:space="preserve">    7.4. Comparison with Existing Research [NEW]</w:t>
+      </w:r>
+    </w:p>
+    <w:p>
+      <w:pPr>
+        <w:rPr>
+          <w:lang w:val="en-GB"/>
+        </w:rPr>
+      </w:pPr>
+      <w:r>
+        <w:rPr>
+          <w:lang w:val="en-GB"/>
+        </w:rPr>
+        <w:t xml:space="preserve">    7.5. Practical Implications [NEW]</w:t>
+      </w:r>
+    </w:p>
+    <w:p>
+      <w:pPr>
+        <w:rPr>
+          <w:lang w:val="en-GB"/>
+        </w:rPr>
+      </w:pPr>
+      <w:r>
+        <w:rPr>
+          <w:lang w:val="en-GB"/>
+        </w:rPr>
+        <w:t xml:space="preserve">    7.6. Generalisability of the Results [NEW]</w:t>
+      </w:r>
+    </w:p>
+    <w:p>
+      <w:pPr>
+        <w:rPr>
+          <w:lang w:val="en-GB"/>
+        </w:rPr>
+      </w:pPr>
+      <w:r>
+        <w:rPr>
+          <w:lang w:val="en-GB"/>
+        </w:rPr>
+        <w:t xml:space="preserve">    7.7. Threats to Validity and Limitations [NEW]</w:t>
+      </w:r>
+    </w:p>
+    <w:p>
+      <w:pPr>
+        <w:rPr>
+          <w:lang w:val="en-GB"/>
+        </w:rPr>
+      </w:pPr>
+    </w:p>
+    <w:p>
+      <w:pPr>
+        <w:rPr>
+          <w:lang w:val="en-GB"/>
+        </w:rPr>
+      </w:pPr>
+    </w:p>
+    <w:p>
+      <w:pPr>
+        <w:rPr>
+          <w:lang w:val="en-GB"/>
+        </w:rPr>
+      </w:pPr>
+      <w:r>
+        <w:rPr>
+          <w:lang w:val="en-GB"/>
+        </w:rPr>
+        <w:t>8. Conclusion and Outlook [CHANGED]</w:t>
+      </w:r>
+    </w:p>
+    <w:p>
+      <w:pPr>
+        <w:rPr>
+          <w:lang w:val="en-GB"/>
+        </w:rPr>
+      </w:pPr>
+      <w:r>
+        <w:rPr>
+          <w:lang w:val="en-GB"/>
+        </w:rPr>
+        <w:t xml:space="preserve">    8.1. Summary of Findings</w:t>
+      </w:r>
+    </w:p>
+    <w:p>
+      <w:pPr>
+        <w:rPr>
+          <w:lang w:val="en-GB"/>
+        </w:rPr>
+      </w:pPr>
+      <w:r>
+        <w:rPr>
+          <w:lang w:val="en-GB"/>
+        </w:rPr>
+        <w:t xml:space="preserve">    8.2. Scientific Contribution</w:t>
+      </w:r>
+    </w:p>
+    <w:p>
+      <w:pPr>
+        <w:rPr>
+          <w:lang w:val="en-GB"/>
+        </w:rPr>
+      </w:pPr>
+      <w:r>
+        <w:rPr>
+          <w:lang w:val="en-GB"/>
+        </w:rPr>
+        <w:t xml:space="preserve">    8.3. Practical Contribution</w:t>
       </w:r>
     </w:p>
     <w:p>
@@ -4544,762 +5770,6 @@
           <w:lang w:val="en-GB"/>
         </w:rPr>
         <w:lastRenderedPageBreak/>
-        <w:t xml:space="preserve">    4.4. Data Lineage</w:t>
-      </w:r>
-    </w:p>
-    <w:p>
-      <w:pPr>
-        <w:rPr>
-          <w:lang w:val="en-GB"/>
-        </w:rPr>
-      </w:pPr>
-      <w:r>
-        <w:rPr>
-          <w:lang w:val="en-GB"/>
-        </w:rPr>
-        <w:t xml:space="preserve">    4.5. Existing Reporting Pipeline</w:t>
-      </w:r>
-    </w:p>
-    <w:p>
-      <w:pPr>
-        <w:rPr>
-          <w:lang w:val="en-GB"/>
-        </w:rPr>
-      </w:pPr>
-      <w:r>
-        <w:rPr>
-          <w:lang w:val="en-GB"/>
-        </w:rPr>
-        <w:t xml:space="preserve">    4.6. Existing Data Quality Reporting and Visualisation</w:t>
-      </w:r>
-    </w:p>
-    <w:p>
-      <w:pPr>
-        <w:rPr>
-          <w:lang w:val="en-GB"/>
-        </w:rPr>
-      </w:pPr>
-      <w:r>
-        <w:rPr>
-          <w:lang w:val="en-GB"/>
-        </w:rPr>
-        <w:t xml:space="preserve">    4.7. Existing DQM Platform and Infrastructure [CHANGED]</w:t>
-      </w:r>
-    </w:p>
-    <w:p>
-      <w:pPr>
-        <w:rPr>
-          <w:lang w:val="en-GB"/>
-        </w:rPr>
-      </w:pPr>
-      <w:r>
-        <w:rPr>
-          <w:lang w:val="en-GB"/>
-        </w:rPr>
-        <w:t xml:space="preserve">    4.8. Baseline for the Master Thesis [NEW]</w:t>
-      </w:r>
-    </w:p>
-    <w:p>
-      <w:pPr>
-        <w:rPr>
-          <w:lang w:val="en-GB"/>
-        </w:rPr>
-      </w:pPr>
-    </w:p>
-    <w:p>
-      <w:pPr>
-        <w:rPr>
-          <w:lang w:val="en-GB"/>
-        </w:rPr>
-      </w:pPr>
-    </w:p>
-    <w:p>
-      <w:pPr>
-        <w:rPr>
-          <w:lang w:val="en-GB"/>
-        </w:rPr>
-      </w:pPr>
-      <w:r>
-        <w:rPr>
-          <w:lang w:val="en-GB"/>
-        </w:rPr>
-        <w:t>5. Implementation</w:t>
-      </w:r>
-    </w:p>
-    <w:p>
-      <w:pPr>
-        <w:rPr>
-          <w:lang w:val="en-GB"/>
-        </w:rPr>
-      </w:pPr>
-      <w:r>
-        <w:rPr>
-          <w:lang w:val="en-GB"/>
-        </w:rPr>
-        <w:t xml:space="preserve">    5.1. Technical and Experimental Setup [CHANGED]</w:t>
-      </w:r>
-    </w:p>
-    <w:p>
-      <w:pPr>
-        <w:rPr>
-          <w:lang w:val="en-GB"/>
-        </w:rPr>
-      </w:pPr>
-    </w:p>
-    <w:p>
-      <w:pPr>
-        <w:rPr>
-          <w:lang w:val="en-GB"/>
-        </w:rPr>
-      </w:pPr>
-      <w:r>
-        <w:rPr>
-          <w:lang w:val="en-GB"/>
-        </w:rPr>
-        <w:t xml:space="preserve">    5.2. </w:t>
-      </w:r>
-      <w:r>
-        <w:rPr>
-          <w:lang w:val="en-GB"/>
-        </w:rPr>
-        <w:t xml:space="preserve">First </w:t>
-      </w:r>
-      <w:r>
-        <w:rPr>
-          <w:lang w:val="en-GB"/>
-        </w:rPr>
-        <w:t xml:space="preserve">Basic </w:t>
-      </w:r>
-      <w:r>
-        <w:rPr>
-          <w:lang w:val="en-GB"/>
-        </w:rPr>
-        <w:t>Detection</w:t>
-      </w:r>
-      <w:r>
-        <w:rPr>
-          <w:lang w:val="en-GB"/>
-        </w:rPr>
-        <w:t xml:space="preserve"> Approach </w:t>
-      </w:r>
-      <w:r>
-        <w:rPr>
-          <w:lang w:val="en-GB"/>
-        </w:rPr>
-        <w:t xml:space="preserve">(Eventually Rule </w:t>
-      </w:r>
-      <w:r>
-        <w:rPr>
-          <w:lang w:val="en-GB"/>
-        </w:rPr>
-        <w:t>based)</w:t>
-      </w:r>
-      <w:r>
-        <w:rPr>
-          <w:lang w:val="en-GB"/>
-        </w:rPr>
-        <w:t xml:space="preserve"> [</w:t>
-      </w:r>
-      <w:r>
-        <w:rPr>
-          <w:lang w:val="en-GB"/>
-        </w:rPr>
-        <w:t>CHANGED]</w:t>
-      </w:r>
-    </w:p>
-    <w:p>
-      <w:pPr>
-        <w:rPr>
-          <w:lang w:val="en-GB"/>
-        </w:rPr>
-      </w:pPr>
-      <w:r>
-        <w:rPr>
-          <w:lang w:val="en-GB"/>
-        </w:rPr>
-        <w:t xml:space="preserve">        5.2.1. Design</w:t>
-      </w:r>
-    </w:p>
-    <w:p>
-      <w:pPr>
-        <w:rPr>
-          <w:lang w:val="en-GB"/>
-        </w:rPr>
-      </w:pPr>
-      <w:r>
-        <w:rPr>
-          <w:lang w:val="en-GB"/>
-        </w:rPr>
-        <w:t xml:space="preserve">        5.2.2. Implementation</w:t>
-      </w:r>
-    </w:p>
-    <w:p>
-      <w:pPr>
-        <w:rPr>
-          <w:lang w:val="en-GB"/>
-        </w:rPr>
-      </w:pPr>
-      <w:r>
-        <w:rPr>
-          <w:lang w:val="en-GB"/>
-        </w:rPr>
-        <w:t xml:space="preserve">        5.2.3. Technical Validation</w:t>
-      </w:r>
-    </w:p>
-    <w:p>
-      <w:pPr>
-        <w:rPr>
-          <w:lang w:val="en-GB"/>
-        </w:rPr>
-      </w:pPr>
-    </w:p>
-    <w:p>
-      <w:pPr>
-        <w:rPr>
-          <w:lang w:val="en-GB"/>
-        </w:rPr>
-      </w:pPr>
-      <w:r>
-        <w:rPr>
-          <w:lang w:val="en-GB"/>
-        </w:rPr>
-        <w:t xml:space="preserve">    5.3. </w:t>
-      </w:r>
-      <w:r>
-        <w:rPr>
-          <w:lang w:val="en-GB"/>
-        </w:rPr>
-        <w:t xml:space="preserve">Improved Detection </w:t>
-      </w:r>
-      <w:r>
-        <w:rPr>
-          <w:lang w:val="en-GB"/>
-        </w:rPr>
-        <w:t>methods</w:t>
-      </w:r>
-      <w:r>
-        <w:rPr>
-          <w:lang w:val="en-GB"/>
-        </w:rPr>
-        <w:t>,</w:t>
-      </w:r>
-      <w:r>
-        <w:rPr>
-          <w:lang w:val="en-GB"/>
-        </w:rPr>
-        <w:t xml:space="preserve"> </w:t>
-      </w:r>
-      <w:r>
-        <w:rPr>
-          <w:lang w:val="en-GB"/>
-        </w:rPr>
-        <w:t>(Statistical?</w:t>
-      </w:r>
-      <w:r>
-        <w:rPr>
-          <w:lang w:val="en-GB"/>
-        </w:rPr>
-        <w:t xml:space="preserve"> Different </w:t>
-      </w:r>
-      <w:r>
-        <w:rPr>
-          <w:lang w:val="en-GB"/>
-        </w:rPr>
-        <w:t>tools?</w:t>
-      </w:r>
-      <w:r>
-        <w:rPr>
-          <w:lang w:val="en-GB"/>
-        </w:rPr>
-        <w:t xml:space="preserve"> My very own </w:t>
-      </w:r>
-      <w:r>
-        <w:rPr>
-          <w:lang w:val="en-GB"/>
-        </w:rPr>
-        <w:t>implementation)</w:t>
-      </w:r>
-      <w:r>
-        <w:rPr>
-          <w:lang w:val="en-GB"/>
-        </w:rPr>
-        <w:t xml:space="preserve"> [</w:t>
-      </w:r>
-      <w:r>
-        <w:rPr>
-          <w:lang w:val="en-GB"/>
-        </w:rPr>
-        <w:t>NEW]</w:t>
-      </w:r>
-    </w:p>
-    <w:p>
-      <w:pPr>
-        <w:rPr>
-          <w:lang w:val="en-GB"/>
-        </w:rPr>
-      </w:pPr>
-      <w:r>
-        <w:rPr>
-          <w:lang w:val="en-GB"/>
-        </w:rPr>
-        <w:t xml:space="preserve">        5.3.1. Design</w:t>
-      </w:r>
-    </w:p>
-    <w:p>
-      <w:pPr>
-        <w:rPr>
-          <w:lang w:val="en-GB"/>
-        </w:rPr>
-      </w:pPr>
-      <w:r>
-        <w:rPr>
-          <w:lang w:val="en-GB"/>
-        </w:rPr>
-        <w:t xml:space="preserve">        5.3.2. Implementation</w:t>
-      </w:r>
-    </w:p>
-    <w:p>
-      <w:pPr>
-        <w:rPr>
-          <w:lang w:val="en-GB"/>
-        </w:rPr>
-      </w:pPr>
-      <w:r>
-        <w:rPr>
-          <w:lang w:val="en-GB"/>
-        </w:rPr>
-        <w:t xml:space="preserve">        5.3.3. Technical Validation</w:t>
-      </w:r>
-    </w:p>
-    <w:p>
-      <w:pPr>
-        <w:rPr>
-          <w:lang w:val="en-GB"/>
-        </w:rPr>
-      </w:pPr>
-    </w:p>
-    <w:p>
-      <w:pPr>
-        <w:rPr>
-          <w:lang w:val="en-GB"/>
-        </w:rPr>
-      </w:pPr>
-      <w:r>
-        <w:rPr>
-          <w:lang w:val="en-GB"/>
-        </w:rPr>
-        <w:t xml:space="preserve">    5.4. Advanced </w:t>
-      </w:r>
-      <w:r>
-        <w:rPr>
-          <w:lang w:val="en-GB"/>
-        </w:rPr>
-        <w:t xml:space="preserve">Detection </w:t>
-      </w:r>
-      <w:r>
-        <w:rPr>
-          <w:lang w:val="en-GB"/>
-        </w:rPr>
-        <w:t>Approach</w:t>
-      </w:r>
-      <w:r>
-        <w:rPr>
-          <w:lang w:val="en-GB"/>
-        </w:rPr>
-        <w:t>, (ML/Own / Extended first second approach / New Ideas… alternative implementation when 1 2 failed)</w:t>
-      </w:r>
-      <w:r>
-        <w:rPr>
-          <w:lang w:val="en-GB"/>
-        </w:rPr>
-        <w:t xml:space="preserve"> [NEW]</w:t>
-      </w:r>
-    </w:p>
-    <w:p>
-      <w:pPr>
-        <w:rPr>
-          <w:lang w:val="en-GB"/>
-        </w:rPr>
-      </w:pPr>
-      <w:r>
-        <w:rPr>
-          <w:lang w:val="en-GB"/>
-        </w:rPr>
-        <w:t xml:space="preserve">        5.4.1. Selection of Approach</w:t>
-      </w:r>
-    </w:p>
-    <w:p>
-      <w:pPr>
-        <w:rPr>
-          <w:lang w:val="en-GB"/>
-        </w:rPr>
-      </w:pPr>
-      <w:r>
-        <w:rPr>
-          <w:lang w:val="en-GB"/>
-        </w:rPr>
-        <w:t xml:space="preserve">        5.4.2. Design</w:t>
-      </w:r>
-    </w:p>
-    <w:p>
-      <w:pPr>
-        <w:rPr>
-          <w:lang w:val="en-GB"/>
-        </w:rPr>
-      </w:pPr>
-      <w:r>
-        <w:rPr>
-          <w:lang w:val="en-GB"/>
-        </w:rPr>
-        <w:t xml:space="preserve">        5.4.3. Implementation</w:t>
-      </w:r>
-    </w:p>
-    <w:p>
-      <w:pPr>
-        <w:rPr>
-          <w:lang w:val="en-GB"/>
-        </w:rPr>
-      </w:pPr>
-      <w:r>
-        <w:rPr>
-          <w:lang w:val="en-GB"/>
-        </w:rPr>
-        <w:t xml:space="preserve">        5.4.4. Technical Validation</w:t>
-      </w:r>
-    </w:p>
-    <w:p>
-      <w:pPr>
-        <w:rPr>
-          <w:lang w:val="en-GB"/>
-        </w:rPr>
-      </w:pPr>
-    </w:p>
-    <w:p>
-      <w:pPr>
-        <w:rPr>
-          <w:lang w:val="en-GB"/>
-        </w:rPr>
-      </w:pPr>
-    </w:p>
-    <w:p>
-      <w:pPr>
-        <w:rPr>
-          <w:lang w:val="en-GB"/>
-        </w:rPr>
-      </w:pPr>
-    </w:p>
-    <w:p>
-      <w:pPr>
-        <w:rPr>
-          <w:lang w:val="en-GB"/>
-        </w:rPr>
-      </w:pPr>
-      <w:r>
-        <w:rPr>
-          <w:lang w:val="en-GB"/>
-        </w:rPr>
-        <w:t>6. Results</w:t>
-      </w:r>
-    </w:p>
-    <w:p>
-      <w:pPr>
-        <w:rPr>
-          <w:lang w:val="en-GB"/>
-        </w:rPr>
-      </w:pPr>
-      <w:r>
-        <w:rPr>
-          <w:lang w:val="en-GB"/>
-        </w:rPr>
-        <w:t xml:space="preserve">    6.1. Introduction</w:t>
-      </w:r>
-    </w:p>
-    <w:p>
-      <w:pPr>
-        <w:rPr>
-          <w:lang w:val="en-GB"/>
-        </w:rPr>
-      </w:pPr>
-      <w:r>
-        <w:rPr>
-          <w:lang w:val="en-GB"/>
-        </w:rPr>
-        <w:lastRenderedPageBreak/>
-        <w:t xml:space="preserve">    6.2. Evaluation Criteria and Experimental Conditions [CHANGED]</w:t>
-      </w:r>
-    </w:p>
-    <w:p>
-      <w:pPr>
-        <w:rPr>
-          <w:lang w:val="en-GB"/>
-        </w:rPr>
-      </w:pPr>
-      <w:r>
-        <w:rPr>
-          <w:lang w:val="en-GB"/>
-        </w:rPr>
-        <w:t xml:space="preserve">    6.3. Rule-Based Approach Results [CHANGED]</w:t>
-      </w:r>
-    </w:p>
-    <w:p>
-      <w:pPr>
-        <w:rPr>
-          <w:lang w:val="en-GB"/>
-        </w:rPr>
-      </w:pPr>
-      <w:r>
-        <w:rPr>
-          <w:lang w:val="en-GB"/>
-        </w:rPr>
-        <w:t xml:space="preserve">    6.4. Statistical Approach Results [NEW]</w:t>
-      </w:r>
-    </w:p>
-    <w:p>
-      <w:pPr>
-        <w:rPr>
-          <w:lang w:val="en-GB"/>
-        </w:rPr>
-      </w:pPr>
-      <w:r>
-        <w:rPr>
-          <w:lang w:val="en-GB"/>
-        </w:rPr>
-        <w:t xml:space="preserve">    6.5. Advanced / Machine-Learning Approach Results [NEW]</w:t>
-      </w:r>
-    </w:p>
-    <w:p>
-      <w:pPr>
-        <w:rPr>
-          <w:lang w:val="en-GB"/>
-        </w:rPr>
-      </w:pPr>
-      <w:r>
-        <w:rPr>
-          <w:lang w:val="en-GB"/>
-        </w:rPr>
-        <w:t xml:space="preserve">    6.6. Comparative Evaluation [NEW]</w:t>
-      </w:r>
-    </w:p>
-    <w:p>
-      <w:pPr>
-        <w:rPr>
-          <w:lang w:val="en-GB"/>
-        </w:rPr>
-      </w:pPr>
-      <w:r>
-        <w:rPr>
-          <w:lang w:val="en-GB"/>
-        </w:rPr>
-        <w:t xml:space="preserve">    6.7. Practical / Stakeholder Evaluation [NEW]</w:t>
-      </w:r>
-    </w:p>
-    <w:p>
-      <w:pPr>
-        <w:rPr>
-          <w:lang w:val="en-GB"/>
-        </w:rPr>
-      </w:pPr>
-      <w:r>
-        <w:rPr>
-          <w:lang w:val="en-GB"/>
-        </w:rPr>
-        <w:t xml:space="preserve">    6.8. Summary</w:t>
-      </w:r>
-    </w:p>
-    <w:p>
-      <w:pPr>
-        <w:rPr>
-          <w:lang w:val="en-GB"/>
-        </w:rPr>
-      </w:pPr>
-    </w:p>
-    <w:p>
-      <w:pPr>
-        <w:rPr>
-          <w:lang w:val="en-GB"/>
-        </w:rPr>
-      </w:pPr>
-    </w:p>
-    <w:p>
-      <w:pPr>
-        <w:rPr>
-          <w:lang w:val="en-GB"/>
-        </w:rPr>
-      </w:pPr>
-      <w:r>
-        <w:rPr>
-          <w:lang w:val="en-GB"/>
-        </w:rPr>
-        <w:t>7. Discussion [CHANGED]</w:t>
-      </w:r>
-    </w:p>
-    <w:p>
-      <w:pPr>
-        <w:rPr>
-          <w:lang w:val="en-GB"/>
-        </w:rPr>
-      </w:pPr>
-      <w:r>
-        <w:rPr>
-          <w:lang w:val="en-GB"/>
-        </w:rPr>
-        <w:t xml:space="preserve">    7.1. Interpretation of Results [NEW]</w:t>
-      </w:r>
-    </w:p>
-    <w:p>
-      <w:pPr>
-        <w:rPr>
-          <w:lang w:val="en-GB"/>
-        </w:rPr>
-      </w:pPr>
-      <w:r>
-        <w:rPr>
-          <w:lang w:val="en-GB"/>
-        </w:rPr>
-        <w:t xml:space="preserve">    7.2. Evaluation of Research Hypotheses [NEW]</w:t>
-      </w:r>
-    </w:p>
-    <w:p>
-      <w:pPr>
-        <w:rPr>
-          <w:lang w:val="en-GB"/>
-        </w:rPr>
-      </w:pPr>
-      <w:r>
-        <w:rPr>
-          <w:lang w:val="en-GB"/>
-        </w:rPr>
-        <w:t xml:space="preserve">    7.3. Answer to the Research Question [NEW]</w:t>
-      </w:r>
-    </w:p>
-    <w:p>
-      <w:pPr>
-        <w:rPr>
-          <w:lang w:val="en-GB"/>
-        </w:rPr>
-      </w:pPr>
-      <w:r>
-        <w:rPr>
-          <w:lang w:val="en-GB"/>
-        </w:rPr>
-        <w:t xml:space="preserve">    7.4. Comparison with Existing Research [NEW]</w:t>
-      </w:r>
-    </w:p>
-    <w:p>
-      <w:pPr>
-        <w:rPr>
-          <w:lang w:val="en-GB"/>
-        </w:rPr>
-      </w:pPr>
-      <w:r>
-        <w:rPr>
-          <w:lang w:val="en-GB"/>
-        </w:rPr>
-        <w:t xml:space="preserve">    7.5. Practical Implications [NEW]</w:t>
-      </w:r>
-    </w:p>
-    <w:p>
-      <w:pPr>
-        <w:rPr>
-          <w:lang w:val="en-GB"/>
-        </w:rPr>
-      </w:pPr>
-      <w:r>
-        <w:rPr>
-          <w:lang w:val="en-GB"/>
-        </w:rPr>
-        <w:t xml:space="preserve">    7.6. Generalisability of the Results [NEW]</w:t>
-      </w:r>
-    </w:p>
-    <w:p>
-      <w:pPr>
-        <w:rPr>
-          <w:lang w:val="en-GB"/>
-        </w:rPr>
-      </w:pPr>
-      <w:r>
-        <w:rPr>
-          <w:lang w:val="en-GB"/>
-        </w:rPr>
-        <w:t xml:space="preserve">    7.7. Threats to Validity and Limitations [NEW]</w:t>
-      </w:r>
-    </w:p>
-    <w:p>
-      <w:pPr>
-        <w:rPr>
-          <w:lang w:val="en-GB"/>
-        </w:rPr>
-      </w:pPr>
-    </w:p>
-    <w:p>
-      <w:pPr>
-        <w:rPr>
-          <w:lang w:val="en-GB"/>
-        </w:rPr>
-      </w:pPr>
-    </w:p>
-    <w:p>
-      <w:pPr>
-        <w:rPr>
-          <w:lang w:val="en-GB"/>
-        </w:rPr>
-      </w:pPr>
-      <w:r>
-        <w:rPr>
-          <w:lang w:val="en-GB"/>
-        </w:rPr>
-        <w:t>8. Conclusion and Outlook [CHANGED]</w:t>
-      </w:r>
-    </w:p>
-    <w:p>
-      <w:pPr>
-        <w:rPr>
-          <w:lang w:val="en-GB"/>
-        </w:rPr>
-      </w:pPr>
-      <w:r>
-        <w:rPr>
-          <w:lang w:val="en-GB"/>
-        </w:rPr>
-        <w:t xml:space="preserve">    8.1. Summary of Findings</w:t>
-      </w:r>
-    </w:p>
-    <w:p>
-      <w:pPr>
-        <w:rPr>
-          <w:lang w:val="en-GB"/>
-        </w:rPr>
-      </w:pPr>
-      <w:r>
-        <w:rPr>
-          <w:lang w:val="en-GB"/>
-        </w:rPr>
-        <w:t xml:space="preserve">    8.2. Scientific Contribution</w:t>
-      </w:r>
-    </w:p>
-    <w:p>
-      <w:pPr>
-        <w:rPr>
-          <w:lang w:val="en-GB"/>
-        </w:rPr>
-      </w:pPr>
-      <w:r>
-        <w:rPr>
-          <w:lang w:val="en-GB"/>
-        </w:rPr>
-        <w:t xml:space="preserve">    8.3. Practical Contribution</w:t>
-      </w:r>
-    </w:p>
-    <w:p>
-      <w:pPr>
-        <w:rPr>
-          <w:lang w:val="en-GB"/>
-        </w:rPr>
-      </w:pPr>
-      <w:r>
-        <w:rPr>
-          <w:lang w:val="en-GB"/>
-        </w:rPr>
         <w:t xml:space="preserve">    8.4. Future Work</w:t>
       </w:r>
     </w:p>
@@ -5386,7 +5856,6 @@
         <w:rPr>
           <w:lang w:val="en-GB"/>
         </w:rPr>
-        <w:lastRenderedPageBreak/>
         <w:t>Bibliography</w:t>
       </w:r>
     </w:p>
@@ -5577,13 +6046,19 @@
       <w:rPr>
         <w:lang w:val="en-GB"/>
       </w:rPr>
-      <w:t>Master Thesis Outline MSc Master i</w:t>
+      <w:t xml:space="preserve">Master Thesis Outline MSc </w:t>
     </w:r>
     <w:r>
       <w:rPr>
         <w:lang w:val="en-GB"/>
       </w:rPr>
-      <w:t>n Engineering Data Science</w:t>
+      <w:t>master’s in engineering data science</w:t>
+    </w:r>
+    <w:r>
+      <w:rPr>
+        <w:lang w:val="en-GB"/>
+      </w:rPr>
+      <w:tab/>
     </w:r>
     <w:r>
       <w:rPr>
@@ -8176,7 +8651,6 @@
   <w:style w:type="character" w:default="1" w:styleId="Absatz-Standardschriftart">
     <w:name w:val="Default Paragraph Font"/>
     <w:uiPriority w:val="1"/>
-    <w:semiHidden/>
     <w:unhideWhenUsed/>
   </w:style>
   <w:style w:type="table" w:default="1" w:styleId="NormaleTabelle">

</xml_diff>